<commit_message>
Sync the package with the revised manuscript (v11d/v11e)
- Redraw Figure 5 as three panels; panel B now reports the dominant cell type after pooling the three myeloid subtypes, with asterisks marking the four candidates whose attribution changes.

- Redraw Figures 1, 4 and 6 (criterion labels, per-sample wording, effect-size title).

- Add the myeloid-merge script and its two result tables.

- Rebuild Supplementary Table S1 with the revised notes (vi) and (vii).

- Refresh README.md and MANIFEST.tsv.
</commit_message>
<xml_diff>
--- a/tables/Supplementary_Table_S1.docx
+++ b/tables/Supplementary_Table_S1.docx
@@ -27,7 +27,7 @@
           <w:b/>
           <w:sz w:val="22"/>
         </w:rPr>
-        <w:t>Sensitivity of the results to the pseudo-count and to the omission of a single animal</w:t>
+        <w:t>Sensitivity of the results to the pseudo-count, to the omission of a single animal, and to the pooling of the myeloid subtypes</w:t>
       </w:r>
     </w:p>
     <w:p>
@@ -40,7 +40,7 @@
           <w:b w:val="0"/>
           <w:sz w:val="18"/>
         </w:rPr>
-        <w:t>Bilingual companion table to Sections 2.15 and 3.6. Both panels were produced by scripts/v11b_pcnt_loo_sensitivity.R from the deposited expression matrix; the pipeline is identical to the main chain (log2(FPKM + pseudo-count), limma-trend, contrasts CCI_t - Sham at 0.5, 1, 3, 7 and 14 d).</w:t>
+        <w:t>Bilingual companion table to Sections 2.11, 2.15, 3.5 and 3.6. Panels A–C were produced by scripts/v11b_pcnt_loo_sensitivity.R and Panel D by scripts/v11_14_myeloid_merge.py; the expression pipeline is identical to the main chain (log2(FPKM + pseudo-count), limma-trend, contrasts CCI_t - Sham at 0.5, 1, 3, 7 and 14 d).</w:t>
       </w:r>
     </w:p>
     <w:p>
@@ -2338,7 +2338,7 @@
           <w:b w:val="0"/>
           <w:sz w:val="18"/>
         </w:rPr>
-        <w:t>Table S1c. The pipeline was repeated 18 times, each time omitting one animal. An entry with two time points means that the assignment changed when an animal was omitted.</w:t>
+        <w:t>Table S1c. The differential-expression model was refitted 18 times, each time omitting one animal, and the 29 already-selected candidates were evaluated in every replicate; clustering, network construction and machine-learning selection were not re-run. An entry with two time points means that the assignment changed when an animal was omitted.</w:t>
       </w:r>
     </w:p>
     <w:tbl>
@@ -4226,10 +4226,1893 @@
       <w:r>
         <w:rPr>
           <w:rFonts w:ascii="Times New Roman" w:hAnsi="Times New Roman" w:eastAsia="宋体"/>
+          <w:b/>
+          <w:sz w:val="22"/>
+        </w:rPr>
+        <w:t>D. Cell-type attribution before and after pooling the myeloid subtypes</w:t>
+      </w:r>
+    </w:p>
+    <w:p>
+      <w:pPr>
+        <w:spacing w:after="120"/>
+      </w:pPr>
+      <w:r>
+        <w:rPr>
+          <w:rFonts w:ascii="Times New Roman" w:hAnsi="Times New Roman" w:eastAsia="宋体"/>
           <w:b w:val="0"/>
           <w:sz w:val="18"/>
         </w:rPr>
-        <w:t>Notes. (i) Pseudo-count 0.10 is the value used throughout the manuscript. (ii) The strict set is the union across the five post-injury time points; the 29 candidates were defined before this analysis and were not re-selected here. (iii) Across the 18 leave-one-animal-out replicates the number of candidates retaining adjusted significance ranged from 22 to 29. (iv) No candidate in any replicate had its peak at 0.5 d or 1 d. (v) A count-based re-analysis could not be performed on these data: the sequencing reads of GSE175760 were deposited as FPKM values only, so such an analysis would require re-quantifying the original reads.</w:t>
+        <w:t>Table S1d. Dominant cell type of each assessable candidate under the original 10 labels and after pooling microglia, macrophages and neutrophils into one myeloid category. Both weightings of the pooled mean gave the same dominant type for every assessable candidate (for Gapt, which fails the criterion, they fall on opposite sides of the myeloid boundary); only the cell-weighted mean is tabulated in full.</w:t>
+      </w:r>
+    </w:p>
+    <w:tbl>
+      <w:tblPr>
+        <w:tblStyle w:val="TableGrid"/>
+        <w:tblW w:type="auto" w:w="0"/>
+        <w:tblLook w:firstColumn="1" w:firstRow="1" w:lastColumn="0" w:lastRow="0" w:noHBand="0" w:noVBand="1" w:val="04A0"/>
+      </w:tblPr>
+      <w:tblGrid>
+        <w:gridCol w:w="1234"/>
+        <w:gridCol w:w="1234"/>
+        <w:gridCol w:w="1234"/>
+        <w:gridCol w:w="1234"/>
+        <w:gridCol w:w="1234"/>
+        <w:gridCol w:w="1234"/>
+        <w:gridCol w:w="1234"/>
+      </w:tblGrid>
+      <w:tr>
+        <w:tc>
+          <w:tcPr>
+            <w:tcW w:type="dxa" w:w="1234"/>
+          </w:tcPr>
+          <w:p>
+            <w:r/>
+            <w:r>
+              <w:rPr>
+                <w:rFonts w:ascii="Times New Roman" w:hAnsi="Times New Roman" w:eastAsia="宋体"/>
+                <w:b/>
+                <w:sz w:val="16"/>
+              </w:rPr>
+              <w:t>Gene</w:t>
+            </w:r>
+          </w:p>
+        </w:tc>
+        <w:tc>
+          <w:tcPr>
+            <w:tcW w:type="dxa" w:w="1234"/>
+          </w:tcPr>
+          <w:p>
+            <w:r/>
+            <w:r>
+              <w:rPr>
+                <w:rFonts w:ascii="Times New Roman" w:hAnsi="Times New Roman" w:eastAsia="宋体"/>
+                <w:b/>
+                <w:sz w:val="16"/>
+              </w:rPr>
+              <w:t>Original dominant</w:t>
+              <w:br/>
+              <w:t>(10 labels)</w:t>
+            </w:r>
+          </w:p>
+        </w:tc>
+        <w:tc>
+          <w:tcPr>
+            <w:tcW w:type="dxa" w:w="1234"/>
+          </w:tcPr>
+          <w:p>
+            <w:r/>
+            <w:r>
+              <w:rPr>
+                <w:rFonts w:ascii="Times New Roman" w:hAnsi="Times New Roman" w:eastAsia="宋体"/>
+                <w:b/>
+                <w:sz w:val="16"/>
+              </w:rPr>
+              <w:t>Pooled dominant</w:t>
+              <w:br/>
+              <w:t>(cell-weighted)</w:t>
+            </w:r>
+          </w:p>
+        </w:tc>
+        <w:tc>
+          <w:tcPr>
+            <w:tcW w:type="dxa" w:w="1234"/>
+          </w:tcPr>
+          <w:p>
+            <w:r/>
+            <w:r>
+              <w:rPr>
+                <w:rFonts w:ascii="Times New Roman" w:hAnsi="Times New Roman" w:eastAsia="宋体"/>
+                <w:b/>
+                <w:sz w:val="16"/>
+              </w:rPr>
+              <w:t>Pooled dominant</w:t>
+              <w:br/>
+              <w:t>(equal weight)</w:t>
+            </w:r>
+          </w:p>
+        </w:tc>
+        <w:tc>
+          <w:tcPr>
+            <w:tcW w:type="dxa" w:w="1234"/>
+          </w:tcPr>
+          <w:p>
+            <w:r/>
+            <w:r>
+              <w:rPr>
+                <w:rFonts w:ascii="Times New Roman" w:hAnsi="Times New Roman" w:eastAsia="宋体"/>
+                <w:b/>
+                <w:sz w:val="16"/>
+              </w:rPr>
+              <w:t>Myeloid mean</w:t>
+              <w:br/>
+              <w:t>(cell-weighted)</w:t>
+            </w:r>
+          </w:p>
+        </w:tc>
+        <w:tc>
+          <w:tcPr>
+            <w:tcW w:type="dxa" w:w="1234"/>
+          </w:tcPr>
+          <w:p>
+            <w:r/>
+            <w:r>
+              <w:rPr>
+                <w:rFonts w:ascii="Times New Roman" w:hAnsi="Times New Roman" w:eastAsia="宋体"/>
+                <w:b/>
+                <w:sz w:val="16"/>
+              </w:rPr>
+              <w:t>Best non-myeloid</w:t>
+              <w:br/>
+              <w:t>(type, mean)</w:t>
+            </w:r>
+          </w:p>
+        </w:tc>
+        <w:tc>
+          <w:tcPr>
+            <w:tcW w:type="dxa" w:w="1234"/>
+          </w:tcPr>
+          <w:p>
+            <w:r/>
+            <w:r>
+              <w:rPr>
+                <w:rFonts w:ascii="Times New Roman" w:hAnsi="Times New Roman" w:eastAsia="宋体"/>
+                <w:b/>
+                <w:sz w:val="16"/>
+              </w:rPr>
+              <w:t>Myeloid-</w:t>
+              <w:br/>
+              <w:t>dominant after</w:t>
+              <w:br/>
+              <w:t>pooling</w:t>
+            </w:r>
+          </w:p>
+        </w:tc>
+      </w:tr>
+      <w:tr>
+        <w:tc>
+          <w:tcPr>
+            <w:tcW w:type="dxa" w:w="1234"/>
+          </w:tcPr>
+          <w:p>
+            <w:r/>
+            <w:r>
+              <w:rPr>
+                <w:rFonts w:ascii="Times New Roman" w:hAnsi="Times New Roman" w:eastAsia="宋体"/>
+                <w:sz w:val="16"/>
+              </w:rPr>
+              <w:t>C1qa</w:t>
+            </w:r>
+          </w:p>
+        </w:tc>
+        <w:tc>
+          <w:tcPr>
+            <w:tcW w:type="dxa" w:w="1234"/>
+          </w:tcPr>
+          <w:p>
+            <w:r/>
+            <w:r>
+              <w:rPr>
+                <w:rFonts w:ascii="Times New Roman" w:hAnsi="Times New Roman" w:eastAsia="宋体"/>
+                <w:sz w:val="16"/>
+              </w:rPr>
+              <w:t>Microglia</w:t>
+            </w:r>
+          </w:p>
+        </w:tc>
+        <w:tc>
+          <w:tcPr>
+            <w:tcW w:type="dxa" w:w="1234"/>
+          </w:tcPr>
+          <w:p>
+            <w:r/>
+            <w:r>
+              <w:rPr>
+                <w:rFonts w:ascii="Times New Roman" w:hAnsi="Times New Roman" w:eastAsia="宋体"/>
+                <w:sz w:val="16"/>
+              </w:rPr>
+              <w:t>Myeloid</w:t>
+            </w:r>
+          </w:p>
+        </w:tc>
+        <w:tc>
+          <w:tcPr>
+            <w:tcW w:type="dxa" w:w="1234"/>
+          </w:tcPr>
+          <w:p>
+            <w:r/>
+            <w:r>
+              <w:rPr>
+                <w:rFonts w:ascii="Times New Roman" w:hAnsi="Times New Roman" w:eastAsia="宋体"/>
+                <w:sz w:val="16"/>
+              </w:rPr>
+              <w:t>Myeloid</w:t>
+            </w:r>
+          </w:p>
+        </w:tc>
+        <w:tc>
+          <w:tcPr>
+            <w:tcW w:type="dxa" w:w="1234"/>
+          </w:tcPr>
+          <w:p>
+            <w:r/>
+            <w:r>
+              <w:rPr>
+                <w:rFonts w:ascii="Times New Roman" w:hAnsi="Times New Roman" w:eastAsia="宋体"/>
+                <w:sz w:val="16"/>
+              </w:rPr>
+              <w:t>3.11</w:t>
+            </w:r>
+          </w:p>
+        </w:tc>
+        <w:tc>
+          <w:tcPr>
+            <w:tcW w:type="dxa" w:w="1234"/>
+          </w:tcPr>
+          <w:p>
+            <w:r/>
+            <w:r>
+              <w:rPr>
+                <w:rFonts w:ascii="Times New Roman" w:hAnsi="Times New Roman" w:eastAsia="宋体"/>
+                <w:sz w:val="16"/>
+              </w:rPr>
+              <w:t>Endothelial (1.12)</w:t>
+            </w:r>
+          </w:p>
+        </w:tc>
+        <w:tc>
+          <w:tcPr>
+            <w:tcW w:type="dxa" w:w="1234"/>
+          </w:tcPr>
+          <w:p>
+            <w:r/>
+            <w:r>
+              <w:rPr>
+                <w:rFonts w:ascii="Times New Roman" w:hAnsi="Times New Roman" w:eastAsia="宋体"/>
+                <w:sz w:val="16"/>
+              </w:rPr>
+              <w:t>yes</w:t>
+            </w:r>
+          </w:p>
+        </w:tc>
+      </w:tr>
+      <w:tr>
+        <w:tc>
+          <w:tcPr>
+            <w:tcW w:type="dxa" w:w="1234"/>
+          </w:tcPr>
+          <w:p>
+            <w:r/>
+            <w:r>
+              <w:rPr>
+                <w:rFonts w:ascii="Times New Roman" w:hAnsi="Times New Roman" w:eastAsia="宋体"/>
+                <w:sz w:val="16"/>
+              </w:rPr>
+              <w:t>Hexb</w:t>
+            </w:r>
+          </w:p>
+        </w:tc>
+        <w:tc>
+          <w:tcPr>
+            <w:tcW w:type="dxa" w:w="1234"/>
+          </w:tcPr>
+          <w:p>
+            <w:r/>
+            <w:r>
+              <w:rPr>
+                <w:rFonts w:ascii="Times New Roman" w:hAnsi="Times New Roman" w:eastAsia="宋体"/>
+                <w:sz w:val="16"/>
+              </w:rPr>
+              <w:t>Microglia</w:t>
+            </w:r>
+          </w:p>
+        </w:tc>
+        <w:tc>
+          <w:tcPr>
+            <w:tcW w:type="dxa" w:w="1234"/>
+          </w:tcPr>
+          <w:p>
+            <w:r/>
+            <w:r>
+              <w:rPr>
+                <w:rFonts w:ascii="Times New Roman" w:hAnsi="Times New Roman" w:eastAsia="宋体"/>
+                <w:sz w:val="16"/>
+              </w:rPr>
+              <w:t>Myeloid</w:t>
+            </w:r>
+          </w:p>
+        </w:tc>
+        <w:tc>
+          <w:tcPr>
+            <w:tcW w:type="dxa" w:w="1234"/>
+          </w:tcPr>
+          <w:p>
+            <w:r/>
+            <w:r>
+              <w:rPr>
+                <w:rFonts w:ascii="Times New Roman" w:hAnsi="Times New Roman" w:eastAsia="宋体"/>
+                <w:sz w:val="16"/>
+              </w:rPr>
+              <w:t>Myeloid</w:t>
+            </w:r>
+          </w:p>
+        </w:tc>
+        <w:tc>
+          <w:tcPr>
+            <w:tcW w:type="dxa" w:w="1234"/>
+          </w:tcPr>
+          <w:p>
+            <w:r/>
+            <w:r>
+              <w:rPr>
+                <w:rFonts w:ascii="Times New Roman" w:hAnsi="Times New Roman" w:eastAsia="宋体"/>
+                <w:sz w:val="16"/>
+              </w:rPr>
+              <w:t>2.62</w:t>
+            </w:r>
+          </w:p>
+        </w:tc>
+        <w:tc>
+          <w:tcPr>
+            <w:tcW w:type="dxa" w:w="1234"/>
+          </w:tcPr>
+          <w:p>
+            <w:r/>
+            <w:r>
+              <w:rPr>
+                <w:rFonts w:ascii="Times New Roman" w:hAnsi="Times New Roman" w:eastAsia="宋体"/>
+                <w:sz w:val="16"/>
+              </w:rPr>
+              <w:t>Endothelial (0.93)</w:t>
+            </w:r>
+          </w:p>
+        </w:tc>
+        <w:tc>
+          <w:tcPr>
+            <w:tcW w:type="dxa" w:w="1234"/>
+          </w:tcPr>
+          <w:p>
+            <w:r/>
+            <w:r>
+              <w:rPr>
+                <w:rFonts w:ascii="Times New Roman" w:hAnsi="Times New Roman" w:eastAsia="宋体"/>
+                <w:sz w:val="16"/>
+              </w:rPr>
+              <w:t>yes</w:t>
+            </w:r>
+          </w:p>
+        </w:tc>
+      </w:tr>
+      <w:tr>
+        <w:tc>
+          <w:tcPr>
+            <w:tcW w:type="dxa" w:w="1234"/>
+          </w:tcPr>
+          <w:p>
+            <w:r/>
+            <w:r>
+              <w:rPr>
+                <w:rFonts w:ascii="Times New Roman" w:hAnsi="Times New Roman" w:eastAsia="宋体"/>
+                <w:sz w:val="16"/>
+              </w:rPr>
+              <w:t>Laptm5</w:t>
+            </w:r>
+          </w:p>
+        </w:tc>
+        <w:tc>
+          <w:tcPr>
+            <w:tcW w:type="dxa" w:w="1234"/>
+          </w:tcPr>
+          <w:p>
+            <w:r/>
+            <w:r>
+              <w:rPr>
+                <w:rFonts w:ascii="Times New Roman" w:hAnsi="Times New Roman" w:eastAsia="宋体"/>
+                <w:sz w:val="16"/>
+              </w:rPr>
+              <w:t>Microglia</w:t>
+            </w:r>
+          </w:p>
+        </w:tc>
+        <w:tc>
+          <w:tcPr>
+            <w:tcW w:type="dxa" w:w="1234"/>
+          </w:tcPr>
+          <w:p>
+            <w:r/>
+            <w:r>
+              <w:rPr>
+                <w:rFonts w:ascii="Times New Roman" w:hAnsi="Times New Roman" w:eastAsia="宋体"/>
+                <w:sz w:val="16"/>
+              </w:rPr>
+              <w:t>Myeloid</w:t>
+            </w:r>
+          </w:p>
+        </w:tc>
+        <w:tc>
+          <w:tcPr>
+            <w:tcW w:type="dxa" w:w="1234"/>
+          </w:tcPr>
+          <w:p>
+            <w:r/>
+            <w:r>
+              <w:rPr>
+                <w:rFonts w:ascii="Times New Roman" w:hAnsi="Times New Roman" w:eastAsia="宋体"/>
+                <w:sz w:val="16"/>
+              </w:rPr>
+              <w:t>Myeloid</w:t>
+            </w:r>
+          </w:p>
+        </w:tc>
+        <w:tc>
+          <w:tcPr>
+            <w:tcW w:type="dxa" w:w="1234"/>
+          </w:tcPr>
+          <w:p>
+            <w:r/>
+            <w:r>
+              <w:rPr>
+                <w:rFonts w:ascii="Times New Roman" w:hAnsi="Times New Roman" w:eastAsia="宋体"/>
+                <w:sz w:val="16"/>
+              </w:rPr>
+              <w:t>2.05</w:t>
+            </w:r>
+          </w:p>
+        </w:tc>
+        <w:tc>
+          <w:tcPr>
+            <w:tcW w:type="dxa" w:w="1234"/>
+          </w:tcPr>
+          <w:p>
+            <w:r/>
+            <w:r>
+              <w:rPr>
+                <w:rFonts w:ascii="Times New Roman" w:hAnsi="Times New Roman" w:eastAsia="宋体"/>
+                <w:sz w:val="16"/>
+              </w:rPr>
+              <w:t>T_cell (1.69)</w:t>
+            </w:r>
+          </w:p>
+        </w:tc>
+        <w:tc>
+          <w:tcPr>
+            <w:tcW w:type="dxa" w:w="1234"/>
+          </w:tcPr>
+          <w:p>
+            <w:r/>
+            <w:r>
+              <w:rPr>
+                <w:rFonts w:ascii="Times New Roman" w:hAnsi="Times New Roman" w:eastAsia="宋体"/>
+                <w:sz w:val="16"/>
+              </w:rPr>
+              <w:t>yes</w:t>
+            </w:r>
+          </w:p>
+        </w:tc>
+      </w:tr>
+      <w:tr>
+        <w:tc>
+          <w:tcPr>
+            <w:tcW w:type="dxa" w:w="1234"/>
+          </w:tcPr>
+          <w:p>
+            <w:r/>
+            <w:r>
+              <w:rPr>
+                <w:rFonts w:ascii="Times New Roman" w:hAnsi="Times New Roman" w:eastAsia="宋体"/>
+                <w:sz w:val="16"/>
+              </w:rPr>
+              <w:t>Cd68</w:t>
+            </w:r>
+          </w:p>
+        </w:tc>
+        <w:tc>
+          <w:tcPr>
+            <w:tcW w:type="dxa" w:w="1234"/>
+          </w:tcPr>
+          <w:p>
+            <w:r/>
+            <w:r>
+              <w:rPr>
+                <w:rFonts w:ascii="Times New Roman" w:hAnsi="Times New Roman" w:eastAsia="宋体"/>
+                <w:sz w:val="16"/>
+              </w:rPr>
+              <w:t>Macrophage</w:t>
+            </w:r>
+          </w:p>
+        </w:tc>
+        <w:tc>
+          <w:tcPr>
+            <w:tcW w:type="dxa" w:w="1234"/>
+          </w:tcPr>
+          <w:p>
+            <w:r/>
+            <w:r>
+              <w:rPr>
+                <w:rFonts w:ascii="Times New Roman" w:hAnsi="Times New Roman" w:eastAsia="宋体"/>
+                <w:sz w:val="16"/>
+              </w:rPr>
+              <w:t>Myeloid</w:t>
+            </w:r>
+          </w:p>
+        </w:tc>
+        <w:tc>
+          <w:tcPr>
+            <w:tcW w:type="dxa" w:w="1234"/>
+          </w:tcPr>
+          <w:p>
+            <w:r/>
+            <w:r>
+              <w:rPr>
+                <w:rFonts w:ascii="Times New Roman" w:hAnsi="Times New Roman" w:eastAsia="宋体"/>
+                <w:sz w:val="16"/>
+              </w:rPr>
+              <w:t>Myeloid</w:t>
+            </w:r>
+          </w:p>
+        </w:tc>
+        <w:tc>
+          <w:tcPr>
+            <w:tcW w:type="dxa" w:w="1234"/>
+          </w:tcPr>
+          <w:p>
+            <w:r/>
+            <w:r>
+              <w:rPr>
+                <w:rFonts w:ascii="Times New Roman" w:hAnsi="Times New Roman" w:eastAsia="宋体"/>
+                <w:sz w:val="16"/>
+              </w:rPr>
+              <w:t>1.67</w:t>
+            </w:r>
+          </w:p>
+        </w:tc>
+        <w:tc>
+          <w:tcPr>
+            <w:tcW w:type="dxa" w:w="1234"/>
+          </w:tcPr>
+          <w:p>
+            <w:r/>
+            <w:r>
+              <w:rPr>
+                <w:rFonts w:ascii="Times New Roman" w:hAnsi="Times New Roman" w:eastAsia="宋体"/>
+                <w:sz w:val="16"/>
+              </w:rPr>
+              <w:t>Pericyte (0.40)</w:t>
+            </w:r>
+          </w:p>
+        </w:tc>
+        <w:tc>
+          <w:tcPr>
+            <w:tcW w:type="dxa" w:w="1234"/>
+          </w:tcPr>
+          <w:p>
+            <w:r/>
+            <w:r>
+              <w:rPr>
+                <w:rFonts w:ascii="Times New Roman" w:hAnsi="Times New Roman" w:eastAsia="宋体"/>
+                <w:sz w:val="16"/>
+              </w:rPr>
+              <w:t>yes</w:t>
+            </w:r>
+          </w:p>
+        </w:tc>
+      </w:tr>
+      <w:tr>
+        <w:tc>
+          <w:tcPr>
+            <w:tcW w:type="dxa" w:w="1234"/>
+          </w:tcPr>
+          <w:p>
+            <w:r/>
+            <w:r>
+              <w:rPr>
+                <w:rFonts w:ascii="Times New Roman" w:hAnsi="Times New Roman" w:eastAsia="宋体"/>
+                <w:sz w:val="16"/>
+              </w:rPr>
+              <w:t>Cd84</w:t>
+            </w:r>
+          </w:p>
+        </w:tc>
+        <w:tc>
+          <w:tcPr>
+            <w:tcW w:type="dxa" w:w="1234"/>
+          </w:tcPr>
+          <w:p>
+            <w:r/>
+            <w:r>
+              <w:rPr>
+                <w:rFonts w:ascii="Times New Roman" w:hAnsi="Times New Roman" w:eastAsia="宋体"/>
+                <w:sz w:val="16"/>
+              </w:rPr>
+              <w:t>Microglia</w:t>
+            </w:r>
+          </w:p>
+        </w:tc>
+        <w:tc>
+          <w:tcPr>
+            <w:tcW w:type="dxa" w:w="1234"/>
+          </w:tcPr>
+          <w:p>
+            <w:r/>
+            <w:r>
+              <w:rPr>
+                <w:rFonts w:ascii="Times New Roman" w:hAnsi="Times New Roman" w:eastAsia="宋体"/>
+                <w:sz w:val="16"/>
+              </w:rPr>
+              <w:t>Myeloid</w:t>
+            </w:r>
+          </w:p>
+        </w:tc>
+        <w:tc>
+          <w:tcPr>
+            <w:tcW w:type="dxa" w:w="1234"/>
+          </w:tcPr>
+          <w:p>
+            <w:r/>
+            <w:r>
+              <w:rPr>
+                <w:rFonts w:ascii="Times New Roman" w:hAnsi="Times New Roman" w:eastAsia="宋体"/>
+                <w:sz w:val="16"/>
+              </w:rPr>
+              <w:t>Myeloid</w:t>
+            </w:r>
+          </w:p>
+        </w:tc>
+        <w:tc>
+          <w:tcPr>
+            <w:tcW w:type="dxa" w:w="1234"/>
+          </w:tcPr>
+          <w:p>
+            <w:r/>
+            <w:r>
+              <w:rPr>
+                <w:rFonts w:ascii="Times New Roman" w:hAnsi="Times New Roman" w:eastAsia="宋体"/>
+                <w:sz w:val="16"/>
+              </w:rPr>
+              <w:t>0.89</w:t>
+            </w:r>
+          </w:p>
+        </w:tc>
+        <w:tc>
+          <w:tcPr>
+            <w:tcW w:type="dxa" w:w="1234"/>
+          </w:tcPr>
+          <w:p>
+            <w:r/>
+            <w:r>
+              <w:rPr>
+                <w:rFonts w:ascii="Times New Roman" w:hAnsi="Times New Roman" w:eastAsia="宋体"/>
+                <w:sz w:val="16"/>
+              </w:rPr>
+              <w:t>T_cell (0.57)</w:t>
+            </w:r>
+          </w:p>
+        </w:tc>
+        <w:tc>
+          <w:tcPr>
+            <w:tcW w:type="dxa" w:w="1234"/>
+          </w:tcPr>
+          <w:p>
+            <w:r/>
+            <w:r>
+              <w:rPr>
+                <w:rFonts w:ascii="Times New Roman" w:hAnsi="Times New Roman" w:eastAsia="宋体"/>
+                <w:sz w:val="16"/>
+              </w:rPr>
+              <w:t>yes</w:t>
+            </w:r>
+          </w:p>
+        </w:tc>
+      </w:tr>
+      <w:tr>
+        <w:tc>
+          <w:tcPr>
+            <w:tcW w:type="dxa" w:w="1234"/>
+          </w:tcPr>
+          <w:p>
+            <w:r/>
+            <w:r>
+              <w:rPr>
+                <w:rFonts w:ascii="Times New Roman" w:hAnsi="Times New Roman" w:eastAsia="宋体"/>
+                <w:sz w:val="16"/>
+              </w:rPr>
+              <w:t>Cfh</w:t>
+            </w:r>
+          </w:p>
+        </w:tc>
+        <w:tc>
+          <w:tcPr>
+            <w:tcW w:type="dxa" w:w="1234"/>
+          </w:tcPr>
+          <w:p>
+            <w:r/>
+            <w:r>
+              <w:rPr>
+                <w:rFonts w:ascii="Times New Roman" w:hAnsi="Times New Roman" w:eastAsia="宋体"/>
+                <w:sz w:val="16"/>
+              </w:rPr>
+              <w:t>Microglia</w:t>
+            </w:r>
+          </w:p>
+        </w:tc>
+        <w:tc>
+          <w:tcPr>
+            <w:tcW w:type="dxa" w:w="1234"/>
+          </w:tcPr>
+          <w:p>
+            <w:r/>
+            <w:r>
+              <w:rPr>
+                <w:rFonts w:ascii="Times New Roman" w:hAnsi="Times New Roman" w:eastAsia="宋体"/>
+                <w:sz w:val="16"/>
+              </w:rPr>
+              <w:t>Pericyte</w:t>
+            </w:r>
+          </w:p>
+        </w:tc>
+        <w:tc>
+          <w:tcPr>
+            <w:tcW w:type="dxa" w:w="1234"/>
+          </w:tcPr>
+          <w:p>
+            <w:r/>
+            <w:r>
+              <w:rPr>
+                <w:rFonts w:ascii="Times New Roman" w:hAnsi="Times New Roman" w:eastAsia="宋体"/>
+                <w:sz w:val="16"/>
+              </w:rPr>
+              <w:t>Pericyte</w:t>
+            </w:r>
+          </w:p>
+        </w:tc>
+        <w:tc>
+          <w:tcPr>
+            <w:tcW w:type="dxa" w:w="1234"/>
+          </w:tcPr>
+          <w:p>
+            <w:r/>
+            <w:r>
+              <w:rPr>
+                <w:rFonts w:ascii="Times New Roman" w:hAnsi="Times New Roman" w:eastAsia="宋体"/>
+                <w:sz w:val="16"/>
+              </w:rPr>
+              <w:t>0.56</w:t>
+            </w:r>
+          </w:p>
+        </w:tc>
+        <w:tc>
+          <w:tcPr>
+            <w:tcW w:type="dxa" w:w="1234"/>
+          </w:tcPr>
+          <w:p>
+            <w:r/>
+            <w:r>
+              <w:rPr>
+                <w:rFonts w:ascii="Times New Roman" w:hAnsi="Times New Roman" w:eastAsia="宋体"/>
+                <w:sz w:val="16"/>
+              </w:rPr>
+              <w:t>Pericyte (0.59)</w:t>
+            </w:r>
+          </w:p>
+        </w:tc>
+        <w:tc>
+          <w:tcPr>
+            <w:tcW w:type="dxa" w:w="1234"/>
+          </w:tcPr>
+          <w:p>
+            <w:r/>
+            <w:r>
+              <w:rPr>
+                <w:rFonts w:ascii="Times New Roman" w:hAnsi="Times New Roman" w:eastAsia="宋体"/>
+                <w:sz w:val="16"/>
+              </w:rPr>
+              <w:t>no</w:t>
+            </w:r>
+          </w:p>
+        </w:tc>
+      </w:tr>
+      <w:tr>
+        <w:tc>
+          <w:tcPr>
+            <w:tcW w:type="dxa" w:w="1234"/>
+          </w:tcPr>
+          <w:p>
+            <w:r/>
+            <w:r>
+              <w:rPr>
+                <w:rFonts w:ascii="Times New Roman" w:hAnsi="Times New Roman" w:eastAsia="宋体"/>
+                <w:sz w:val="16"/>
+              </w:rPr>
+              <w:t>Nrp1</w:t>
+            </w:r>
+          </w:p>
+        </w:tc>
+        <w:tc>
+          <w:tcPr>
+            <w:tcW w:type="dxa" w:w="1234"/>
+          </w:tcPr>
+          <w:p>
+            <w:r/>
+            <w:r>
+              <w:rPr>
+                <w:rFonts w:ascii="Times New Roman" w:hAnsi="Times New Roman" w:eastAsia="宋体"/>
+                <w:sz w:val="16"/>
+              </w:rPr>
+              <w:t>Microglia</w:t>
+            </w:r>
+          </w:p>
+        </w:tc>
+        <w:tc>
+          <w:tcPr>
+            <w:tcW w:type="dxa" w:w="1234"/>
+          </w:tcPr>
+          <w:p>
+            <w:r/>
+            <w:r>
+              <w:rPr>
+                <w:rFonts w:ascii="Times New Roman" w:hAnsi="Times New Roman" w:eastAsia="宋体"/>
+                <w:sz w:val="16"/>
+              </w:rPr>
+              <w:t>Endothelial</w:t>
+            </w:r>
+          </w:p>
+        </w:tc>
+        <w:tc>
+          <w:tcPr>
+            <w:tcW w:type="dxa" w:w="1234"/>
+          </w:tcPr>
+          <w:p>
+            <w:r/>
+            <w:r>
+              <w:rPr>
+                <w:rFonts w:ascii="Times New Roman" w:hAnsi="Times New Roman" w:eastAsia="宋体"/>
+                <w:sz w:val="16"/>
+              </w:rPr>
+              <w:t>Endothelial</w:t>
+            </w:r>
+          </w:p>
+        </w:tc>
+        <w:tc>
+          <w:tcPr>
+            <w:tcW w:type="dxa" w:w="1234"/>
+          </w:tcPr>
+          <w:p>
+            <w:r/>
+            <w:r>
+              <w:rPr>
+                <w:rFonts w:ascii="Times New Roman" w:hAnsi="Times New Roman" w:eastAsia="宋体"/>
+                <w:sz w:val="16"/>
+              </w:rPr>
+              <w:t>0.54</w:t>
+            </w:r>
+          </w:p>
+        </w:tc>
+        <w:tc>
+          <w:tcPr>
+            <w:tcW w:type="dxa" w:w="1234"/>
+          </w:tcPr>
+          <w:p>
+            <w:r/>
+            <w:r>
+              <w:rPr>
+                <w:rFonts w:ascii="Times New Roman" w:hAnsi="Times New Roman" w:eastAsia="宋体"/>
+                <w:sz w:val="16"/>
+              </w:rPr>
+              <w:t>Endothelial (0.62)</w:t>
+            </w:r>
+          </w:p>
+        </w:tc>
+        <w:tc>
+          <w:tcPr>
+            <w:tcW w:type="dxa" w:w="1234"/>
+          </w:tcPr>
+          <w:p>
+            <w:r/>
+            <w:r>
+              <w:rPr>
+                <w:rFonts w:ascii="Times New Roman" w:hAnsi="Times New Roman" w:eastAsia="宋体"/>
+                <w:sz w:val="16"/>
+              </w:rPr>
+              <w:t>no</w:t>
+            </w:r>
+          </w:p>
+        </w:tc>
+      </w:tr>
+      <w:tr>
+        <w:tc>
+          <w:tcPr>
+            <w:tcW w:type="dxa" w:w="1234"/>
+          </w:tcPr>
+          <w:p>
+            <w:r/>
+            <w:r>
+              <w:rPr>
+                <w:rFonts w:ascii="Times New Roman" w:hAnsi="Times New Roman" w:eastAsia="宋体"/>
+                <w:sz w:val="16"/>
+              </w:rPr>
+              <w:t>Lmo2</w:t>
+            </w:r>
+          </w:p>
+        </w:tc>
+        <w:tc>
+          <w:tcPr>
+            <w:tcW w:type="dxa" w:w="1234"/>
+          </w:tcPr>
+          <w:p>
+            <w:r/>
+            <w:r>
+              <w:rPr>
+                <w:rFonts w:ascii="Times New Roman" w:hAnsi="Times New Roman" w:eastAsia="宋体"/>
+                <w:sz w:val="16"/>
+              </w:rPr>
+              <w:t>Microglia</w:t>
+            </w:r>
+          </w:p>
+        </w:tc>
+        <w:tc>
+          <w:tcPr>
+            <w:tcW w:type="dxa" w:w="1234"/>
+          </w:tcPr>
+          <w:p>
+            <w:r/>
+            <w:r>
+              <w:rPr>
+                <w:rFonts w:ascii="Times New Roman" w:hAnsi="Times New Roman" w:eastAsia="宋体"/>
+                <w:sz w:val="16"/>
+              </w:rPr>
+              <w:t>Endothelial</w:t>
+            </w:r>
+          </w:p>
+        </w:tc>
+        <w:tc>
+          <w:tcPr>
+            <w:tcW w:type="dxa" w:w="1234"/>
+          </w:tcPr>
+          <w:p>
+            <w:r/>
+            <w:r>
+              <w:rPr>
+                <w:rFonts w:ascii="Times New Roman" w:hAnsi="Times New Roman" w:eastAsia="宋体"/>
+                <w:sz w:val="16"/>
+              </w:rPr>
+              <w:t>Endothelial</w:t>
+            </w:r>
+          </w:p>
+        </w:tc>
+        <w:tc>
+          <w:tcPr>
+            <w:tcW w:type="dxa" w:w="1234"/>
+          </w:tcPr>
+          <w:p>
+            <w:r/>
+            <w:r>
+              <w:rPr>
+                <w:rFonts w:ascii="Times New Roman" w:hAnsi="Times New Roman" w:eastAsia="宋体"/>
+                <w:sz w:val="16"/>
+              </w:rPr>
+              <w:t>0.54</w:t>
+            </w:r>
+          </w:p>
+        </w:tc>
+        <w:tc>
+          <w:tcPr>
+            <w:tcW w:type="dxa" w:w="1234"/>
+          </w:tcPr>
+          <w:p>
+            <w:r/>
+            <w:r>
+              <w:rPr>
+                <w:rFonts w:ascii="Times New Roman" w:hAnsi="Times New Roman" w:eastAsia="宋体"/>
+                <w:sz w:val="16"/>
+              </w:rPr>
+              <w:t>Endothelial (0.63)</w:t>
+            </w:r>
+          </w:p>
+        </w:tc>
+        <w:tc>
+          <w:tcPr>
+            <w:tcW w:type="dxa" w:w="1234"/>
+          </w:tcPr>
+          <w:p>
+            <w:r/>
+            <w:r>
+              <w:rPr>
+                <w:rFonts w:ascii="Times New Roman" w:hAnsi="Times New Roman" w:eastAsia="宋体"/>
+                <w:sz w:val="16"/>
+              </w:rPr>
+              <w:t>no</w:t>
+            </w:r>
+          </w:p>
+        </w:tc>
+      </w:tr>
+      <w:tr>
+        <w:tc>
+          <w:tcPr>
+            <w:tcW w:type="dxa" w:w="1234"/>
+          </w:tcPr>
+          <w:p>
+            <w:r/>
+            <w:r>
+              <w:rPr>
+                <w:rFonts w:ascii="Times New Roman" w:hAnsi="Times New Roman" w:eastAsia="宋体"/>
+                <w:sz w:val="16"/>
+              </w:rPr>
+              <w:t>Klhl6</w:t>
+            </w:r>
+          </w:p>
+        </w:tc>
+        <w:tc>
+          <w:tcPr>
+            <w:tcW w:type="dxa" w:w="1234"/>
+          </w:tcPr>
+          <w:p>
+            <w:r/>
+            <w:r>
+              <w:rPr>
+                <w:rFonts w:ascii="Times New Roman" w:hAnsi="Times New Roman" w:eastAsia="宋体"/>
+                <w:sz w:val="16"/>
+              </w:rPr>
+              <w:t>B_cell</w:t>
+            </w:r>
+          </w:p>
+        </w:tc>
+        <w:tc>
+          <w:tcPr>
+            <w:tcW w:type="dxa" w:w="1234"/>
+          </w:tcPr>
+          <w:p>
+            <w:r/>
+            <w:r>
+              <w:rPr>
+                <w:rFonts w:ascii="Times New Roman" w:hAnsi="Times New Roman" w:eastAsia="宋体"/>
+                <w:sz w:val="16"/>
+              </w:rPr>
+              <w:t>B_cell</w:t>
+            </w:r>
+          </w:p>
+        </w:tc>
+        <w:tc>
+          <w:tcPr>
+            <w:tcW w:type="dxa" w:w="1234"/>
+          </w:tcPr>
+          <w:p>
+            <w:r/>
+            <w:r>
+              <w:rPr>
+                <w:rFonts w:ascii="Times New Roman" w:hAnsi="Times New Roman" w:eastAsia="宋体"/>
+                <w:sz w:val="16"/>
+              </w:rPr>
+              <w:t>B_cell</w:t>
+            </w:r>
+          </w:p>
+        </w:tc>
+        <w:tc>
+          <w:tcPr>
+            <w:tcW w:type="dxa" w:w="1234"/>
+          </w:tcPr>
+          <w:p>
+            <w:r/>
+            <w:r>
+              <w:rPr>
+                <w:rFonts w:ascii="Times New Roman" w:hAnsi="Times New Roman" w:eastAsia="宋体"/>
+                <w:sz w:val="16"/>
+              </w:rPr>
+              <w:t>0.28</w:t>
+            </w:r>
+          </w:p>
+        </w:tc>
+        <w:tc>
+          <w:tcPr>
+            <w:tcW w:type="dxa" w:w="1234"/>
+          </w:tcPr>
+          <w:p>
+            <w:r/>
+            <w:r>
+              <w:rPr>
+                <w:rFonts w:ascii="Times New Roman" w:hAnsi="Times New Roman" w:eastAsia="宋体"/>
+                <w:sz w:val="16"/>
+              </w:rPr>
+              <w:t>B_cell (0.54)</w:t>
+            </w:r>
+          </w:p>
+        </w:tc>
+        <w:tc>
+          <w:tcPr>
+            <w:tcW w:type="dxa" w:w="1234"/>
+          </w:tcPr>
+          <w:p>
+            <w:r/>
+            <w:r>
+              <w:rPr>
+                <w:rFonts w:ascii="Times New Roman" w:hAnsi="Times New Roman" w:eastAsia="宋体"/>
+                <w:sz w:val="16"/>
+              </w:rPr>
+              <w:t>no</w:t>
+            </w:r>
+          </w:p>
+        </w:tc>
+      </w:tr>
+      <w:tr>
+        <w:tc>
+          <w:tcPr>
+            <w:tcW w:type="dxa" w:w="1234"/>
+          </w:tcPr>
+          <w:p>
+            <w:r/>
+            <w:r>
+              <w:rPr>
+                <w:rFonts w:ascii="Times New Roman" w:hAnsi="Times New Roman" w:eastAsia="宋体"/>
+                <w:sz w:val="16"/>
+              </w:rPr>
+              <w:t>Fbxw4</w:t>
+            </w:r>
+          </w:p>
+        </w:tc>
+        <w:tc>
+          <w:tcPr>
+            <w:tcW w:type="dxa" w:w="1234"/>
+          </w:tcPr>
+          <w:p>
+            <w:r/>
+            <w:r>
+              <w:rPr>
+                <w:rFonts w:ascii="Times New Roman" w:hAnsi="Times New Roman" w:eastAsia="宋体"/>
+                <w:sz w:val="16"/>
+              </w:rPr>
+              <w:t>Microglia</w:t>
+            </w:r>
+          </w:p>
+        </w:tc>
+        <w:tc>
+          <w:tcPr>
+            <w:tcW w:type="dxa" w:w="1234"/>
+          </w:tcPr>
+          <w:p>
+            <w:r/>
+            <w:r>
+              <w:rPr>
+                <w:rFonts w:ascii="Times New Roman" w:hAnsi="Times New Roman" w:eastAsia="宋体"/>
+                <w:sz w:val="16"/>
+              </w:rPr>
+              <w:t>Myeloid</w:t>
+            </w:r>
+          </w:p>
+        </w:tc>
+        <w:tc>
+          <w:tcPr>
+            <w:tcW w:type="dxa" w:w="1234"/>
+          </w:tcPr>
+          <w:p>
+            <w:r/>
+            <w:r>
+              <w:rPr>
+                <w:rFonts w:ascii="Times New Roman" w:hAnsi="Times New Roman" w:eastAsia="宋体"/>
+                <w:sz w:val="16"/>
+              </w:rPr>
+              <w:t>Myeloid</w:t>
+            </w:r>
+          </w:p>
+        </w:tc>
+        <w:tc>
+          <w:tcPr>
+            <w:tcW w:type="dxa" w:w="1234"/>
+          </w:tcPr>
+          <w:p>
+            <w:r/>
+            <w:r>
+              <w:rPr>
+                <w:rFonts w:ascii="Times New Roman" w:hAnsi="Times New Roman" w:eastAsia="宋体"/>
+                <w:sz w:val="16"/>
+              </w:rPr>
+              <w:t>0.24</w:t>
+            </w:r>
+          </w:p>
+        </w:tc>
+        <w:tc>
+          <w:tcPr>
+            <w:tcW w:type="dxa" w:w="1234"/>
+          </w:tcPr>
+          <w:p>
+            <w:r/>
+            <w:r>
+              <w:rPr>
+                <w:rFonts w:ascii="Times New Roman" w:hAnsi="Times New Roman" w:eastAsia="宋体"/>
+                <w:sz w:val="16"/>
+              </w:rPr>
+              <w:t>T_cell (0.12)</w:t>
+            </w:r>
+          </w:p>
+        </w:tc>
+        <w:tc>
+          <w:tcPr>
+            <w:tcW w:type="dxa" w:w="1234"/>
+          </w:tcPr>
+          <w:p>
+            <w:r/>
+            <w:r>
+              <w:rPr>
+                <w:rFonts w:ascii="Times New Roman" w:hAnsi="Times New Roman" w:eastAsia="宋体"/>
+                <w:sz w:val="16"/>
+              </w:rPr>
+              <w:t>yes</w:t>
+            </w:r>
+          </w:p>
+        </w:tc>
+      </w:tr>
+      <w:tr>
+        <w:tc>
+          <w:tcPr>
+            <w:tcW w:type="dxa" w:w="1234"/>
+          </w:tcPr>
+          <w:p>
+            <w:r/>
+            <w:r>
+              <w:rPr>
+                <w:rFonts w:ascii="Times New Roman" w:hAnsi="Times New Roman" w:eastAsia="宋体"/>
+                <w:sz w:val="16"/>
+              </w:rPr>
+              <w:t>Arhgap25</w:t>
+            </w:r>
+          </w:p>
+        </w:tc>
+        <w:tc>
+          <w:tcPr>
+            <w:tcW w:type="dxa" w:w="1234"/>
+          </w:tcPr>
+          <w:p>
+            <w:r/>
+            <w:r>
+              <w:rPr>
+                <w:rFonts w:ascii="Times New Roman" w:hAnsi="Times New Roman" w:eastAsia="宋体"/>
+                <w:sz w:val="16"/>
+              </w:rPr>
+              <w:t>Microglia</w:t>
+            </w:r>
+          </w:p>
+        </w:tc>
+        <w:tc>
+          <w:tcPr>
+            <w:tcW w:type="dxa" w:w="1234"/>
+          </w:tcPr>
+          <w:p>
+            <w:r/>
+            <w:r>
+              <w:rPr>
+                <w:rFonts w:ascii="Times New Roman" w:hAnsi="Times New Roman" w:eastAsia="宋体"/>
+                <w:sz w:val="16"/>
+              </w:rPr>
+              <w:t>B_cell</w:t>
+            </w:r>
+          </w:p>
+        </w:tc>
+        <w:tc>
+          <w:tcPr>
+            <w:tcW w:type="dxa" w:w="1234"/>
+          </w:tcPr>
+          <w:p>
+            <w:r/>
+            <w:r>
+              <w:rPr>
+                <w:rFonts w:ascii="Times New Roman" w:hAnsi="Times New Roman" w:eastAsia="宋体"/>
+                <w:sz w:val="16"/>
+              </w:rPr>
+              <w:t>B_cell</w:t>
+            </w:r>
+          </w:p>
+        </w:tc>
+        <w:tc>
+          <w:tcPr>
+            <w:tcW w:type="dxa" w:w="1234"/>
+          </w:tcPr>
+          <w:p>
+            <w:r/>
+            <w:r>
+              <w:rPr>
+                <w:rFonts w:ascii="Times New Roman" w:hAnsi="Times New Roman" w:eastAsia="宋体"/>
+                <w:sz w:val="16"/>
+              </w:rPr>
+              <w:t>0.24</w:t>
+            </w:r>
+          </w:p>
+        </w:tc>
+        <w:tc>
+          <w:tcPr>
+            <w:tcW w:type="dxa" w:w="1234"/>
+          </w:tcPr>
+          <w:p>
+            <w:r/>
+            <w:r>
+              <w:rPr>
+                <w:rFonts w:ascii="Times New Roman" w:hAnsi="Times New Roman" w:eastAsia="宋体"/>
+                <w:sz w:val="16"/>
+              </w:rPr>
+              <w:t>B_cell (0.27)</w:t>
+            </w:r>
+          </w:p>
+        </w:tc>
+        <w:tc>
+          <w:tcPr>
+            <w:tcW w:type="dxa" w:w="1234"/>
+          </w:tcPr>
+          <w:p>
+            <w:r/>
+            <w:r>
+              <w:rPr>
+                <w:rFonts w:ascii="Times New Roman" w:hAnsi="Times New Roman" w:eastAsia="宋体"/>
+                <w:sz w:val="16"/>
+              </w:rPr>
+              <w:t>no</w:t>
+            </w:r>
+          </w:p>
+        </w:tc>
+      </w:tr>
+      <w:tr>
+        <w:tc>
+          <w:tcPr>
+            <w:tcW w:type="dxa" w:w="1234"/>
+          </w:tcPr>
+          <w:p>
+            <w:r/>
+            <w:r>
+              <w:rPr>
+                <w:rFonts w:ascii="Times New Roman" w:hAnsi="Times New Roman" w:eastAsia="宋体"/>
+                <w:sz w:val="16"/>
+              </w:rPr>
+              <w:t>Rassf3</w:t>
+            </w:r>
+          </w:p>
+        </w:tc>
+        <w:tc>
+          <w:tcPr>
+            <w:tcW w:type="dxa" w:w="1234"/>
+          </w:tcPr>
+          <w:p>
+            <w:r/>
+            <w:r>
+              <w:rPr>
+                <w:rFonts w:ascii="Times New Roman" w:hAnsi="Times New Roman" w:eastAsia="宋体"/>
+                <w:sz w:val="16"/>
+              </w:rPr>
+              <w:t>Neutrophil</w:t>
+            </w:r>
+          </w:p>
+        </w:tc>
+        <w:tc>
+          <w:tcPr>
+            <w:tcW w:type="dxa" w:w="1234"/>
+          </w:tcPr>
+          <w:p>
+            <w:r/>
+            <w:r>
+              <w:rPr>
+                <w:rFonts w:ascii="Times New Roman" w:hAnsi="Times New Roman" w:eastAsia="宋体"/>
+                <w:sz w:val="16"/>
+              </w:rPr>
+              <w:t>Myeloid</w:t>
+            </w:r>
+          </w:p>
+        </w:tc>
+        <w:tc>
+          <w:tcPr>
+            <w:tcW w:type="dxa" w:w="1234"/>
+          </w:tcPr>
+          <w:p>
+            <w:r/>
+            <w:r>
+              <w:rPr>
+                <w:rFonts w:ascii="Times New Roman" w:hAnsi="Times New Roman" w:eastAsia="宋体"/>
+                <w:sz w:val="16"/>
+              </w:rPr>
+              <w:t>Myeloid</w:t>
+            </w:r>
+          </w:p>
+        </w:tc>
+        <w:tc>
+          <w:tcPr>
+            <w:tcW w:type="dxa" w:w="1234"/>
+          </w:tcPr>
+          <w:p>
+            <w:r/>
+            <w:r>
+              <w:rPr>
+                <w:rFonts w:ascii="Times New Roman" w:hAnsi="Times New Roman" w:eastAsia="宋体"/>
+                <w:sz w:val="16"/>
+              </w:rPr>
+              <w:t>0.20</w:t>
+            </w:r>
+          </w:p>
+        </w:tc>
+        <w:tc>
+          <w:tcPr>
+            <w:tcW w:type="dxa" w:w="1234"/>
+          </w:tcPr>
+          <w:p>
+            <w:r/>
+            <w:r>
+              <w:rPr>
+                <w:rFonts w:ascii="Times New Roman" w:hAnsi="Times New Roman" w:eastAsia="宋体"/>
+                <w:sz w:val="16"/>
+              </w:rPr>
+              <w:t>Endothelial (0.15)</w:t>
+            </w:r>
+          </w:p>
+        </w:tc>
+        <w:tc>
+          <w:tcPr>
+            <w:tcW w:type="dxa" w:w="1234"/>
+          </w:tcPr>
+          <w:p>
+            <w:r/>
+            <w:r>
+              <w:rPr>
+                <w:rFonts w:ascii="Times New Roman" w:hAnsi="Times New Roman" w:eastAsia="宋体"/>
+                <w:sz w:val="16"/>
+              </w:rPr>
+              <w:t>yes</w:t>
+            </w:r>
+          </w:p>
+        </w:tc>
+      </w:tr>
+      <w:tr>
+        <w:tc>
+          <w:tcPr>
+            <w:tcW w:type="dxa" w:w="1234"/>
+          </w:tcPr>
+          <w:p>
+            <w:r/>
+            <w:r>
+              <w:rPr>
+                <w:rFonts w:ascii="Times New Roman" w:hAnsi="Times New Roman" w:eastAsia="宋体"/>
+                <w:sz w:val="16"/>
+              </w:rPr>
+              <w:t>Zc3h12a</w:t>
+            </w:r>
+          </w:p>
+        </w:tc>
+        <w:tc>
+          <w:tcPr>
+            <w:tcW w:type="dxa" w:w="1234"/>
+          </w:tcPr>
+          <w:p>
+            <w:r/>
+            <w:r>
+              <w:rPr>
+                <w:rFonts w:ascii="Times New Roman" w:hAnsi="Times New Roman" w:eastAsia="宋体"/>
+                <w:sz w:val="16"/>
+              </w:rPr>
+              <w:t>Neutrophil</w:t>
+            </w:r>
+          </w:p>
+        </w:tc>
+        <w:tc>
+          <w:tcPr>
+            <w:tcW w:type="dxa" w:w="1234"/>
+          </w:tcPr>
+          <w:p>
+            <w:r/>
+            <w:r>
+              <w:rPr>
+                <w:rFonts w:ascii="Times New Roman" w:hAnsi="Times New Roman" w:eastAsia="宋体"/>
+                <w:sz w:val="16"/>
+              </w:rPr>
+              <w:t>Myeloid</w:t>
+            </w:r>
+          </w:p>
+        </w:tc>
+        <w:tc>
+          <w:tcPr>
+            <w:tcW w:type="dxa" w:w="1234"/>
+          </w:tcPr>
+          <w:p>
+            <w:r/>
+            <w:r>
+              <w:rPr>
+                <w:rFonts w:ascii="Times New Roman" w:hAnsi="Times New Roman" w:eastAsia="宋体"/>
+                <w:sz w:val="16"/>
+              </w:rPr>
+              <w:t>Myeloid</w:t>
+            </w:r>
+          </w:p>
+        </w:tc>
+        <w:tc>
+          <w:tcPr>
+            <w:tcW w:type="dxa" w:w="1234"/>
+          </w:tcPr>
+          <w:p>
+            <w:r/>
+            <w:r>
+              <w:rPr>
+                <w:rFonts w:ascii="Times New Roman" w:hAnsi="Times New Roman" w:eastAsia="宋体"/>
+                <w:sz w:val="16"/>
+              </w:rPr>
+              <w:t>0.13</w:t>
+            </w:r>
+          </w:p>
+        </w:tc>
+        <w:tc>
+          <w:tcPr>
+            <w:tcW w:type="dxa" w:w="1234"/>
+          </w:tcPr>
+          <w:p>
+            <w:r/>
+            <w:r>
+              <w:rPr>
+                <w:rFonts w:ascii="Times New Roman" w:hAnsi="Times New Roman" w:eastAsia="宋体"/>
+                <w:sz w:val="16"/>
+              </w:rPr>
+              <w:t>B_cell (0.10)</w:t>
+            </w:r>
+          </w:p>
+        </w:tc>
+        <w:tc>
+          <w:tcPr>
+            <w:tcW w:type="dxa" w:w="1234"/>
+          </w:tcPr>
+          <w:p>
+            <w:r/>
+            <w:r>
+              <w:rPr>
+                <w:rFonts w:ascii="Times New Roman" w:hAnsi="Times New Roman" w:eastAsia="宋体"/>
+                <w:sz w:val="16"/>
+              </w:rPr>
+              <w:t>yes</w:t>
+            </w:r>
+          </w:p>
+        </w:tc>
+      </w:tr>
+      <w:tr>
+        <w:tc>
+          <w:tcPr>
+            <w:tcW w:type="dxa" w:w="1234"/>
+          </w:tcPr>
+          <w:p>
+            <w:r/>
+            <w:r>
+              <w:rPr>
+                <w:rFonts w:ascii="Times New Roman" w:hAnsi="Times New Roman" w:eastAsia="宋体"/>
+                <w:sz w:val="16"/>
+              </w:rPr>
+              <w:t>Man2b2</w:t>
+            </w:r>
+          </w:p>
+        </w:tc>
+        <w:tc>
+          <w:tcPr>
+            <w:tcW w:type="dxa" w:w="1234"/>
+          </w:tcPr>
+          <w:p>
+            <w:r/>
+            <w:r>
+              <w:rPr>
+                <w:rFonts w:ascii="Times New Roman" w:hAnsi="Times New Roman" w:eastAsia="宋体"/>
+                <w:sz w:val="16"/>
+              </w:rPr>
+              <w:t>Microglia</w:t>
+            </w:r>
+          </w:p>
+        </w:tc>
+        <w:tc>
+          <w:tcPr>
+            <w:tcW w:type="dxa" w:w="1234"/>
+          </w:tcPr>
+          <w:p>
+            <w:r/>
+            <w:r>
+              <w:rPr>
+                <w:rFonts w:ascii="Times New Roman" w:hAnsi="Times New Roman" w:eastAsia="宋体"/>
+                <w:sz w:val="16"/>
+              </w:rPr>
+              <w:t>Myeloid</w:t>
+            </w:r>
+          </w:p>
+        </w:tc>
+        <w:tc>
+          <w:tcPr>
+            <w:tcW w:type="dxa" w:w="1234"/>
+          </w:tcPr>
+          <w:p>
+            <w:r/>
+            <w:r>
+              <w:rPr>
+                <w:rFonts w:ascii="Times New Roman" w:hAnsi="Times New Roman" w:eastAsia="宋体"/>
+                <w:sz w:val="16"/>
+              </w:rPr>
+              <w:t>Myeloid</w:t>
+            </w:r>
+          </w:p>
+        </w:tc>
+        <w:tc>
+          <w:tcPr>
+            <w:tcW w:type="dxa" w:w="1234"/>
+          </w:tcPr>
+          <w:p>
+            <w:r/>
+            <w:r>
+              <w:rPr>
+                <w:rFonts w:ascii="Times New Roman" w:hAnsi="Times New Roman" w:eastAsia="宋体"/>
+                <w:sz w:val="16"/>
+              </w:rPr>
+              <w:t>0.10</w:t>
+            </w:r>
+          </w:p>
+        </w:tc>
+        <w:tc>
+          <w:tcPr>
+            <w:tcW w:type="dxa" w:w="1234"/>
+          </w:tcPr>
+          <w:p>
+            <w:r/>
+            <w:r>
+              <w:rPr>
+                <w:rFonts w:ascii="Times New Roman" w:hAnsi="Times New Roman" w:eastAsia="宋体"/>
+                <w:sz w:val="16"/>
+              </w:rPr>
+              <w:t>T_cell (0.05)</w:t>
+            </w:r>
+          </w:p>
+        </w:tc>
+        <w:tc>
+          <w:tcPr>
+            <w:tcW w:type="dxa" w:w="1234"/>
+          </w:tcPr>
+          <w:p>
+            <w:r/>
+            <w:r>
+              <w:rPr>
+                <w:rFonts w:ascii="Times New Roman" w:hAnsi="Times New Roman" w:eastAsia="宋体"/>
+                <w:sz w:val="16"/>
+              </w:rPr>
+              <w:t>yes</w:t>
+            </w:r>
+          </w:p>
+        </w:tc>
+      </w:tr>
+      <w:tr>
+        <w:tc>
+          <w:tcPr>
+            <w:tcW w:type="dxa" w:w="1234"/>
+          </w:tcPr>
+          <w:p>
+            <w:r/>
+            <w:r>
+              <w:rPr>
+                <w:rFonts w:ascii="Times New Roman" w:hAnsi="Times New Roman" w:eastAsia="宋体"/>
+                <w:sz w:val="16"/>
+              </w:rPr>
+              <w:t>Mrpl10</w:t>
+            </w:r>
+          </w:p>
+        </w:tc>
+        <w:tc>
+          <w:tcPr>
+            <w:tcW w:type="dxa" w:w="1234"/>
+          </w:tcPr>
+          <w:p>
+            <w:r/>
+            <w:r>
+              <w:rPr>
+                <w:rFonts w:ascii="Times New Roman" w:hAnsi="Times New Roman" w:eastAsia="宋体"/>
+                <w:sz w:val="16"/>
+              </w:rPr>
+              <w:t>Ependymal</w:t>
+            </w:r>
+          </w:p>
+        </w:tc>
+        <w:tc>
+          <w:tcPr>
+            <w:tcW w:type="dxa" w:w="1234"/>
+          </w:tcPr>
+          <w:p>
+            <w:r/>
+            <w:r>
+              <w:rPr>
+                <w:rFonts w:ascii="Times New Roman" w:hAnsi="Times New Roman" w:eastAsia="宋体"/>
+                <w:sz w:val="16"/>
+              </w:rPr>
+              <w:t>Ependymal</w:t>
+            </w:r>
+          </w:p>
+        </w:tc>
+        <w:tc>
+          <w:tcPr>
+            <w:tcW w:type="dxa" w:w="1234"/>
+          </w:tcPr>
+          <w:p>
+            <w:r/>
+            <w:r>
+              <w:rPr>
+                <w:rFonts w:ascii="Times New Roman" w:hAnsi="Times New Roman" w:eastAsia="宋体"/>
+                <w:sz w:val="16"/>
+              </w:rPr>
+              <w:t>Ependymal</w:t>
+            </w:r>
+          </w:p>
+        </w:tc>
+        <w:tc>
+          <w:tcPr>
+            <w:tcW w:type="dxa" w:w="1234"/>
+          </w:tcPr>
+          <w:p>
+            <w:r/>
+            <w:r>
+              <w:rPr>
+                <w:rFonts w:ascii="Times New Roman" w:hAnsi="Times New Roman" w:eastAsia="宋体"/>
+                <w:sz w:val="16"/>
+              </w:rPr>
+              <w:t>0.09</w:t>
+            </w:r>
+          </w:p>
+        </w:tc>
+        <w:tc>
+          <w:tcPr>
+            <w:tcW w:type="dxa" w:w="1234"/>
+          </w:tcPr>
+          <w:p>
+            <w:r/>
+            <w:r>
+              <w:rPr>
+                <w:rFonts w:ascii="Times New Roman" w:hAnsi="Times New Roman" w:eastAsia="宋体"/>
+                <w:sz w:val="16"/>
+              </w:rPr>
+              <w:t>Ependymal (0.18)</w:t>
+            </w:r>
+          </w:p>
+        </w:tc>
+        <w:tc>
+          <w:tcPr>
+            <w:tcW w:type="dxa" w:w="1234"/>
+          </w:tcPr>
+          <w:p>
+            <w:r/>
+            <w:r>
+              <w:rPr>
+                <w:rFonts w:ascii="Times New Roman" w:hAnsi="Times New Roman" w:eastAsia="宋体"/>
+                <w:sz w:val="16"/>
+              </w:rPr>
+              <w:t>no</w:t>
+            </w:r>
+          </w:p>
+        </w:tc>
+      </w:tr>
+      <w:tr>
+        <w:tc>
+          <w:tcPr>
+            <w:tcW w:type="dxa" w:w="1234"/>
+          </w:tcPr>
+          <w:p>
+            <w:r/>
+            <w:r>
+              <w:rPr>
+                <w:rFonts w:ascii="Times New Roman" w:hAnsi="Times New Roman" w:eastAsia="宋体"/>
+                <w:sz w:val="16"/>
+              </w:rPr>
+              <w:t>Rfx7</w:t>
+            </w:r>
+          </w:p>
+        </w:tc>
+        <w:tc>
+          <w:tcPr>
+            <w:tcW w:type="dxa" w:w="1234"/>
+          </w:tcPr>
+          <w:p>
+            <w:r/>
+            <w:r>
+              <w:rPr>
+                <w:rFonts w:ascii="Times New Roman" w:hAnsi="Times New Roman" w:eastAsia="宋体"/>
+                <w:sz w:val="16"/>
+              </w:rPr>
+              <w:t>B_cell</w:t>
+            </w:r>
+          </w:p>
+        </w:tc>
+        <w:tc>
+          <w:tcPr>
+            <w:tcW w:type="dxa" w:w="1234"/>
+          </w:tcPr>
+          <w:p>
+            <w:r/>
+            <w:r>
+              <w:rPr>
+                <w:rFonts w:ascii="Times New Roman" w:hAnsi="Times New Roman" w:eastAsia="宋体"/>
+                <w:sz w:val="16"/>
+              </w:rPr>
+              <w:t>B_cell</w:t>
+            </w:r>
+          </w:p>
+        </w:tc>
+        <w:tc>
+          <w:tcPr>
+            <w:tcW w:type="dxa" w:w="1234"/>
+          </w:tcPr>
+          <w:p>
+            <w:r/>
+            <w:r>
+              <w:rPr>
+                <w:rFonts w:ascii="Times New Roman" w:hAnsi="Times New Roman" w:eastAsia="宋体"/>
+                <w:sz w:val="16"/>
+              </w:rPr>
+              <w:t>B_cell</w:t>
+            </w:r>
+          </w:p>
+        </w:tc>
+        <w:tc>
+          <w:tcPr>
+            <w:tcW w:type="dxa" w:w="1234"/>
+          </w:tcPr>
+          <w:p>
+            <w:r/>
+            <w:r>
+              <w:rPr>
+                <w:rFonts w:ascii="Times New Roman" w:hAnsi="Times New Roman" w:eastAsia="宋体"/>
+                <w:sz w:val="16"/>
+              </w:rPr>
+              <w:t>0.06</w:t>
+            </w:r>
+          </w:p>
+        </w:tc>
+        <w:tc>
+          <w:tcPr>
+            <w:tcW w:type="dxa" w:w="1234"/>
+          </w:tcPr>
+          <w:p>
+            <w:r/>
+            <w:r>
+              <w:rPr>
+                <w:rFonts w:ascii="Times New Roman" w:hAnsi="Times New Roman" w:eastAsia="宋体"/>
+                <w:sz w:val="16"/>
+              </w:rPr>
+              <w:t>B_cell (0.20)</w:t>
+            </w:r>
+          </w:p>
+        </w:tc>
+        <w:tc>
+          <w:tcPr>
+            <w:tcW w:type="dxa" w:w="1234"/>
+          </w:tcPr>
+          <w:p>
+            <w:r/>
+            <w:r>
+              <w:rPr>
+                <w:rFonts w:ascii="Times New Roman" w:hAnsi="Times New Roman" w:eastAsia="宋体"/>
+                <w:sz w:val="16"/>
+              </w:rPr>
+              <w:t>no</w:t>
+            </w:r>
+          </w:p>
+        </w:tc>
+      </w:tr>
+    </w:tbl>
+    <w:p/>
+    <w:p>
+      <w:pPr>
+        <w:spacing w:after="120"/>
+      </w:pPr>
+      <w:r>
+        <w:rPr>
+          <w:rFonts w:ascii="Times New Roman" w:hAnsi="Times New Roman" w:eastAsia="宋体"/>
+          <w:b w:val="0"/>
+          <w:sz w:val="18"/>
+        </w:rPr>
+        <w:t>Notes. (i) Pseudo-count 0.10 is the value used throughout the manuscript. (ii) The strict set is the union across the five post-injury time points; the 29 candidates were defined before this analysis and were not re-selected here. (iii) Across the 18 leave-one-animal-out replicates the number of candidates retaining adjusted significance ranged from 22 to 29. (iv) No candidate in any replicate had its peak at 0.5 d or 1 d. (v) A count-based re-analysis could not be performed on these data: the processed matrix used here contains no original read counts, so a count model could not be fitted to it; such an analysis would require re-quantifying the deposited reads. (vi) Five of the 29 candidates (Clec7a, Fcrl2, C4a, Dnase2, AABR07034445.1) were not found in the annotation matrix of the single-cell reference, and eight further candidates failed the assessability criterion, which requires both a maximum detection rate above 10 % and a maximum mean expression above 0.1: seven had maximum detection rates below 10 % (Fbxl7 (0.1 %); Reg3b (0.1 %); Svop (0.3 %); Ecel1 (0.5 %); Mmp3 (1.1 %); Chrna1 (2.1 %); Nlrc4 (2.5 %)) and one (Gapt) reached a maximum detection rate of 11.0 % with a maximum mean expression of 0.09, below the 0.1 required. Neither group is shown in Panel D. (vii) Pooling the three myeloid subtypes changes the label of the 13 assessable candidates that were attributed to microglia, macrophages or neutrophils, but the dominant type after recomputing the mean over the pooled cells is myeloid for only 9 of the 16 assessable candidates; the other four (Cfh, Nrp1, Lmo2, Arhgap25) fall just behind a non-myeloid type. Values for all detected candidates, including those that are not assessable, are provided in results/myeloid_merge_dominant_celltype.csv. (viii) The two pooled weightings gave the same dominant type for all 16 assessable candidates; among the eight that failed the criterion they disagree for Gapt only (cell-weighted B cell, equal weight myeloid), which is one of the reasons that gene is not interpreted.</w:t>
       </w:r>
     </w:p>
     <w:p>
@@ -4262,7 +6145,7 @@
           <w:b/>
           <w:sz w:val="22"/>
         </w:rPr>
-        <w:t>结果对伪计数与单只动物剔除的敏感性</w:t>
+        <w:t>结果对伪计数、单只动物剔除与髓系亚型合并的敏感性</w:t>
       </w:r>
     </w:p>
     <w:p>
@@ -4275,7 +6158,7 @@
           <w:b w:val="0"/>
           <w:sz w:val="18"/>
         </w:rPr>
-        <w:t>本表为正文 2.15 节与 3.6 节的双语配套材料。两个面板均由 scripts/v11b_pcnt_loo_sensitivity.R 从已存档的表达矩阵生成，管线与主链完全一致（log2(FPKM + 伪计数) + limma-trend，对比 CCI_t − Sham，时间点 0.5、1、3、7、14 天）。</w:t>
+        <w:t>本表为正文 2.11、2.15、3.5 与 3.6 节的双语配套材料。面板 A–C 由 scripts/v11b_pcnt_loo_sensitivity.R 生成，面板 D 由 scripts/v11_14_myeloid_merge.py 生成；表达管线与主链完全一致（log2(FPKM + 伪计数) + limma-trend，对比 CCI_t − Sham，时间点 0.5、1、3、7、14 天）。</w:t>
       </w:r>
     </w:p>
     <w:p>
@@ -4667,7 +6550,7 @@
           <w:b w:val="0"/>
           <w:sz w:val="18"/>
         </w:rPr>
-        <w:t>表 S1b。取该候选绝对效应量最大时点的 log2 倍数变化。29 个候选在三种伪计数下的峰值时点与变化方向完全一致。</w:t>
+        <w:t>表 S1b。取该候选绝对效应量最大时点的 log2 倍数变化（峰值定义见 2.15 节）。29 个候选在三种伪计数下的峰值时点与变化方向完全一致。</w:t>
       </w:r>
     </w:p>
     <w:tbl>
@@ -6571,7 +8454,7 @@
           <w:b w:val="0"/>
           <w:sz w:val="18"/>
         </w:rPr>
-        <w:t>表 S1c。管线重复 18 次，每次剔除一只动物。峰值时点列出两项者，表示剔除该动物后归属发生改变。</w:t>
+        <w:t>表 S1c。差异表达模型重复拟合 18 次，每次剔除一只动物，并在每次重采样中对已选出的 29 个候选逐一评估；聚类、网络构建与机器学习筛选未重跑。峰值时点列出两项者，表示剔除该动物后归属发生改变。</w:t>
       </w:r>
     </w:p>
     <w:tbl>
@@ -8459,10 +10342,1889 @@
       <w:r>
         <w:rPr>
           <w:rFonts w:ascii="Times New Roman" w:hAnsi="Times New Roman" w:eastAsia="宋体"/>
+          <w:b/>
+          <w:sz w:val="22"/>
+        </w:rPr>
+        <w:t>D. 髓系亚型合并前后的细胞类型归属</w:t>
+      </w:r>
+    </w:p>
+    <w:p>
+      <w:pPr>
+        <w:spacing w:after="120"/>
+      </w:pPr>
+      <w:r>
+        <w:rPr>
+          <w:rFonts w:ascii="Times New Roman" w:hAnsi="Times New Roman" w:eastAsia="宋体"/>
           <w:b w:val="0"/>
           <w:sz w:val="18"/>
         </w:rPr>
-        <w:t>注。（i）伪计数 0.10 为全文所用取值。（ii）严格集为五个损伤后时间点的并集；29 个候选在本分析之前即已确定，此处未重新筛选。（iii）18 次留一重采样中，保持校正显著的候选数在 22 至 29 之间。（iv）任何一次重采样中均没有候选的峰值落在 0.5 天或 1 天。（v）基于计数的再分析无法在这批数据上开展：GSE175760 的测序读段仅以 FPKM 形式存档，此类分析须对原始读段重新定量。</w:t>
+        <w:t>表 S1d。各可评估候选在原始 10 类标签下的优势细胞类型，以及将小胶质细胞、巨噬细胞、中性粒细胞合并为单一髓系类别后的优势类型。两种合并均值口径对每个可评估候选给出相同的优势类型（对未通过判据的 Gapt 二者分处髓系边界两侧）；表中仅完整列出按细胞数加权的口径。</w:t>
+      </w:r>
+    </w:p>
+    <w:tbl>
+      <w:tblPr>
+        <w:tblStyle w:val="TableGrid"/>
+        <w:tblW w:type="auto" w:w="0"/>
+        <w:tblLook w:firstColumn="1" w:firstRow="1" w:lastColumn="0" w:lastRow="0" w:noHBand="0" w:noVBand="1" w:val="04A0"/>
+      </w:tblPr>
+      <w:tblGrid>
+        <w:gridCol w:w="1234"/>
+        <w:gridCol w:w="1234"/>
+        <w:gridCol w:w="1234"/>
+        <w:gridCol w:w="1234"/>
+        <w:gridCol w:w="1234"/>
+        <w:gridCol w:w="1234"/>
+        <w:gridCol w:w="1234"/>
+      </w:tblGrid>
+      <w:tr>
+        <w:tc>
+          <w:tcPr>
+            <w:tcW w:type="dxa" w:w="1234"/>
+          </w:tcPr>
+          <w:p>
+            <w:r/>
+            <w:r>
+              <w:rPr>
+                <w:rFonts w:ascii="Times New Roman" w:hAnsi="Times New Roman" w:eastAsia="宋体"/>
+                <w:b/>
+                <w:sz w:val="16"/>
+              </w:rPr>
+              <w:t>基因</w:t>
+            </w:r>
+          </w:p>
+        </w:tc>
+        <w:tc>
+          <w:tcPr>
+            <w:tcW w:type="dxa" w:w="1234"/>
+          </w:tcPr>
+          <w:p>
+            <w:r/>
+            <w:r>
+              <w:rPr>
+                <w:rFonts w:ascii="Times New Roman" w:hAnsi="Times New Roman" w:eastAsia="宋体"/>
+                <w:b/>
+                <w:sz w:val="16"/>
+              </w:rPr>
+              <w:t>原始优势类型</w:t>
+              <w:br/>
+              <w:t>（10 类标签）</w:t>
+            </w:r>
+          </w:p>
+        </w:tc>
+        <w:tc>
+          <w:tcPr>
+            <w:tcW w:type="dxa" w:w="1234"/>
+          </w:tcPr>
+          <w:p>
+            <w:r/>
+            <w:r>
+              <w:rPr>
+                <w:rFonts w:ascii="Times New Roman" w:hAnsi="Times New Roman" w:eastAsia="宋体"/>
+                <w:b/>
+                <w:sz w:val="16"/>
+              </w:rPr>
+              <w:t>合并后优势类型</w:t>
+              <w:br/>
+              <w:t>（细胞数加权）</w:t>
+            </w:r>
+          </w:p>
+        </w:tc>
+        <w:tc>
+          <w:tcPr>
+            <w:tcW w:type="dxa" w:w="1234"/>
+          </w:tcPr>
+          <w:p>
+            <w:r/>
+            <w:r>
+              <w:rPr>
+                <w:rFonts w:ascii="Times New Roman" w:hAnsi="Times New Roman" w:eastAsia="宋体"/>
+                <w:b/>
+                <w:sz w:val="16"/>
+              </w:rPr>
+              <w:t>合并后优势类型</w:t>
+              <w:br/>
+              <w:t>（亚型等权）</w:t>
+            </w:r>
+          </w:p>
+        </w:tc>
+        <w:tc>
+          <w:tcPr>
+            <w:tcW w:type="dxa" w:w="1234"/>
+          </w:tcPr>
+          <w:p>
+            <w:r/>
+            <w:r>
+              <w:rPr>
+                <w:rFonts w:ascii="Times New Roman" w:hAnsi="Times New Roman" w:eastAsia="宋体"/>
+                <w:b/>
+                <w:sz w:val="16"/>
+              </w:rPr>
+              <w:t>髓系均值</w:t>
+              <w:br/>
+              <w:t>（细胞数加权）</w:t>
+            </w:r>
+          </w:p>
+        </w:tc>
+        <w:tc>
+          <w:tcPr>
+            <w:tcW w:type="dxa" w:w="1234"/>
+          </w:tcPr>
+          <w:p>
+            <w:r/>
+            <w:r>
+              <w:rPr>
+                <w:rFonts w:ascii="Times New Roman" w:hAnsi="Times New Roman" w:eastAsia="宋体"/>
+                <w:b/>
+                <w:sz w:val="16"/>
+              </w:rPr>
+              <w:t>最强非髓系类型（均值）</w:t>
+            </w:r>
+          </w:p>
+        </w:tc>
+        <w:tc>
+          <w:tcPr>
+            <w:tcW w:type="dxa" w:w="1234"/>
+          </w:tcPr>
+          <w:p>
+            <w:r/>
+            <w:r>
+              <w:rPr>
+                <w:rFonts w:ascii="Times New Roman" w:hAnsi="Times New Roman" w:eastAsia="宋体"/>
+                <w:b/>
+                <w:sz w:val="16"/>
+              </w:rPr>
+              <w:t>合并后是否为</w:t>
+              <w:br/>
+              <w:t>髓系优势</w:t>
+            </w:r>
+          </w:p>
+        </w:tc>
+      </w:tr>
+      <w:tr>
+        <w:tc>
+          <w:tcPr>
+            <w:tcW w:type="dxa" w:w="1234"/>
+          </w:tcPr>
+          <w:p>
+            <w:r/>
+            <w:r>
+              <w:rPr>
+                <w:rFonts w:ascii="Times New Roman" w:hAnsi="Times New Roman" w:eastAsia="宋体"/>
+                <w:sz w:val="16"/>
+              </w:rPr>
+              <w:t>C1qa</w:t>
+            </w:r>
+          </w:p>
+        </w:tc>
+        <w:tc>
+          <w:tcPr>
+            <w:tcW w:type="dxa" w:w="1234"/>
+          </w:tcPr>
+          <w:p>
+            <w:r/>
+            <w:r>
+              <w:rPr>
+                <w:rFonts w:ascii="Times New Roman" w:hAnsi="Times New Roman" w:eastAsia="宋体"/>
+                <w:sz w:val="16"/>
+              </w:rPr>
+              <w:t>Microglia</w:t>
+            </w:r>
+          </w:p>
+        </w:tc>
+        <w:tc>
+          <w:tcPr>
+            <w:tcW w:type="dxa" w:w="1234"/>
+          </w:tcPr>
+          <w:p>
+            <w:r/>
+            <w:r>
+              <w:rPr>
+                <w:rFonts w:ascii="Times New Roman" w:hAnsi="Times New Roman" w:eastAsia="宋体"/>
+                <w:sz w:val="16"/>
+              </w:rPr>
+              <w:t>Myeloid</w:t>
+            </w:r>
+          </w:p>
+        </w:tc>
+        <w:tc>
+          <w:tcPr>
+            <w:tcW w:type="dxa" w:w="1234"/>
+          </w:tcPr>
+          <w:p>
+            <w:r/>
+            <w:r>
+              <w:rPr>
+                <w:rFonts w:ascii="Times New Roman" w:hAnsi="Times New Roman" w:eastAsia="宋体"/>
+                <w:sz w:val="16"/>
+              </w:rPr>
+              <w:t>Myeloid</w:t>
+            </w:r>
+          </w:p>
+        </w:tc>
+        <w:tc>
+          <w:tcPr>
+            <w:tcW w:type="dxa" w:w="1234"/>
+          </w:tcPr>
+          <w:p>
+            <w:r/>
+            <w:r>
+              <w:rPr>
+                <w:rFonts w:ascii="Times New Roman" w:hAnsi="Times New Roman" w:eastAsia="宋体"/>
+                <w:sz w:val="16"/>
+              </w:rPr>
+              <w:t>3.11</w:t>
+            </w:r>
+          </w:p>
+        </w:tc>
+        <w:tc>
+          <w:tcPr>
+            <w:tcW w:type="dxa" w:w="1234"/>
+          </w:tcPr>
+          <w:p>
+            <w:r/>
+            <w:r>
+              <w:rPr>
+                <w:rFonts w:ascii="Times New Roman" w:hAnsi="Times New Roman" w:eastAsia="宋体"/>
+                <w:sz w:val="16"/>
+              </w:rPr>
+              <w:t>Endothelial（1.12）</w:t>
+            </w:r>
+          </w:p>
+        </w:tc>
+        <w:tc>
+          <w:tcPr>
+            <w:tcW w:type="dxa" w:w="1234"/>
+          </w:tcPr>
+          <w:p>
+            <w:r/>
+            <w:r>
+              <w:rPr>
+                <w:rFonts w:ascii="Times New Roman" w:hAnsi="Times New Roman" w:eastAsia="宋体"/>
+                <w:sz w:val="16"/>
+              </w:rPr>
+              <w:t>是</w:t>
+            </w:r>
+          </w:p>
+        </w:tc>
+      </w:tr>
+      <w:tr>
+        <w:tc>
+          <w:tcPr>
+            <w:tcW w:type="dxa" w:w="1234"/>
+          </w:tcPr>
+          <w:p>
+            <w:r/>
+            <w:r>
+              <w:rPr>
+                <w:rFonts w:ascii="Times New Roman" w:hAnsi="Times New Roman" w:eastAsia="宋体"/>
+                <w:sz w:val="16"/>
+              </w:rPr>
+              <w:t>Hexb</w:t>
+            </w:r>
+          </w:p>
+        </w:tc>
+        <w:tc>
+          <w:tcPr>
+            <w:tcW w:type="dxa" w:w="1234"/>
+          </w:tcPr>
+          <w:p>
+            <w:r/>
+            <w:r>
+              <w:rPr>
+                <w:rFonts w:ascii="Times New Roman" w:hAnsi="Times New Roman" w:eastAsia="宋体"/>
+                <w:sz w:val="16"/>
+              </w:rPr>
+              <w:t>Microglia</w:t>
+            </w:r>
+          </w:p>
+        </w:tc>
+        <w:tc>
+          <w:tcPr>
+            <w:tcW w:type="dxa" w:w="1234"/>
+          </w:tcPr>
+          <w:p>
+            <w:r/>
+            <w:r>
+              <w:rPr>
+                <w:rFonts w:ascii="Times New Roman" w:hAnsi="Times New Roman" w:eastAsia="宋体"/>
+                <w:sz w:val="16"/>
+              </w:rPr>
+              <w:t>Myeloid</w:t>
+            </w:r>
+          </w:p>
+        </w:tc>
+        <w:tc>
+          <w:tcPr>
+            <w:tcW w:type="dxa" w:w="1234"/>
+          </w:tcPr>
+          <w:p>
+            <w:r/>
+            <w:r>
+              <w:rPr>
+                <w:rFonts w:ascii="Times New Roman" w:hAnsi="Times New Roman" w:eastAsia="宋体"/>
+                <w:sz w:val="16"/>
+              </w:rPr>
+              <w:t>Myeloid</w:t>
+            </w:r>
+          </w:p>
+        </w:tc>
+        <w:tc>
+          <w:tcPr>
+            <w:tcW w:type="dxa" w:w="1234"/>
+          </w:tcPr>
+          <w:p>
+            <w:r/>
+            <w:r>
+              <w:rPr>
+                <w:rFonts w:ascii="Times New Roman" w:hAnsi="Times New Roman" w:eastAsia="宋体"/>
+                <w:sz w:val="16"/>
+              </w:rPr>
+              <w:t>2.62</w:t>
+            </w:r>
+          </w:p>
+        </w:tc>
+        <w:tc>
+          <w:tcPr>
+            <w:tcW w:type="dxa" w:w="1234"/>
+          </w:tcPr>
+          <w:p>
+            <w:r/>
+            <w:r>
+              <w:rPr>
+                <w:rFonts w:ascii="Times New Roman" w:hAnsi="Times New Roman" w:eastAsia="宋体"/>
+                <w:sz w:val="16"/>
+              </w:rPr>
+              <w:t>Endothelial（0.93）</w:t>
+            </w:r>
+          </w:p>
+        </w:tc>
+        <w:tc>
+          <w:tcPr>
+            <w:tcW w:type="dxa" w:w="1234"/>
+          </w:tcPr>
+          <w:p>
+            <w:r/>
+            <w:r>
+              <w:rPr>
+                <w:rFonts w:ascii="Times New Roman" w:hAnsi="Times New Roman" w:eastAsia="宋体"/>
+                <w:sz w:val="16"/>
+              </w:rPr>
+              <w:t>是</w:t>
+            </w:r>
+          </w:p>
+        </w:tc>
+      </w:tr>
+      <w:tr>
+        <w:tc>
+          <w:tcPr>
+            <w:tcW w:type="dxa" w:w="1234"/>
+          </w:tcPr>
+          <w:p>
+            <w:r/>
+            <w:r>
+              <w:rPr>
+                <w:rFonts w:ascii="Times New Roman" w:hAnsi="Times New Roman" w:eastAsia="宋体"/>
+                <w:sz w:val="16"/>
+              </w:rPr>
+              <w:t>Laptm5</w:t>
+            </w:r>
+          </w:p>
+        </w:tc>
+        <w:tc>
+          <w:tcPr>
+            <w:tcW w:type="dxa" w:w="1234"/>
+          </w:tcPr>
+          <w:p>
+            <w:r/>
+            <w:r>
+              <w:rPr>
+                <w:rFonts w:ascii="Times New Roman" w:hAnsi="Times New Roman" w:eastAsia="宋体"/>
+                <w:sz w:val="16"/>
+              </w:rPr>
+              <w:t>Microglia</w:t>
+            </w:r>
+          </w:p>
+        </w:tc>
+        <w:tc>
+          <w:tcPr>
+            <w:tcW w:type="dxa" w:w="1234"/>
+          </w:tcPr>
+          <w:p>
+            <w:r/>
+            <w:r>
+              <w:rPr>
+                <w:rFonts w:ascii="Times New Roman" w:hAnsi="Times New Roman" w:eastAsia="宋体"/>
+                <w:sz w:val="16"/>
+              </w:rPr>
+              <w:t>Myeloid</w:t>
+            </w:r>
+          </w:p>
+        </w:tc>
+        <w:tc>
+          <w:tcPr>
+            <w:tcW w:type="dxa" w:w="1234"/>
+          </w:tcPr>
+          <w:p>
+            <w:r/>
+            <w:r>
+              <w:rPr>
+                <w:rFonts w:ascii="Times New Roman" w:hAnsi="Times New Roman" w:eastAsia="宋体"/>
+                <w:sz w:val="16"/>
+              </w:rPr>
+              <w:t>Myeloid</w:t>
+            </w:r>
+          </w:p>
+        </w:tc>
+        <w:tc>
+          <w:tcPr>
+            <w:tcW w:type="dxa" w:w="1234"/>
+          </w:tcPr>
+          <w:p>
+            <w:r/>
+            <w:r>
+              <w:rPr>
+                <w:rFonts w:ascii="Times New Roman" w:hAnsi="Times New Roman" w:eastAsia="宋体"/>
+                <w:sz w:val="16"/>
+              </w:rPr>
+              <w:t>2.05</w:t>
+            </w:r>
+          </w:p>
+        </w:tc>
+        <w:tc>
+          <w:tcPr>
+            <w:tcW w:type="dxa" w:w="1234"/>
+          </w:tcPr>
+          <w:p>
+            <w:r/>
+            <w:r>
+              <w:rPr>
+                <w:rFonts w:ascii="Times New Roman" w:hAnsi="Times New Roman" w:eastAsia="宋体"/>
+                <w:sz w:val="16"/>
+              </w:rPr>
+              <w:t>T_cell（1.69）</w:t>
+            </w:r>
+          </w:p>
+        </w:tc>
+        <w:tc>
+          <w:tcPr>
+            <w:tcW w:type="dxa" w:w="1234"/>
+          </w:tcPr>
+          <w:p>
+            <w:r/>
+            <w:r>
+              <w:rPr>
+                <w:rFonts w:ascii="Times New Roman" w:hAnsi="Times New Roman" w:eastAsia="宋体"/>
+                <w:sz w:val="16"/>
+              </w:rPr>
+              <w:t>是</w:t>
+            </w:r>
+          </w:p>
+        </w:tc>
+      </w:tr>
+      <w:tr>
+        <w:tc>
+          <w:tcPr>
+            <w:tcW w:type="dxa" w:w="1234"/>
+          </w:tcPr>
+          <w:p>
+            <w:r/>
+            <w:r>
+              <w:rPr>
+                <w:rFonts w:ascii="Times New Roman" w:hAnsi="Times New Roman" w:eastAsia="宋体"/>
+                <w:sz w:val="16"/>
+              </w:rPr>
+              <w:t>Cd68</w:t>
+            </w:r>
+          </w:p>
+        </w:tc>
+        <w:tc>
+          <w:tcPr>
+            <w:tcW w:type="dxa" w:w="1234"/>
+          </w:tcPr>
+          <w:p>
+            <w:r/>
+            <w:r>
+              <w:rPr>
+                <w:rFonts w:ascii="Times New Roman" w:hAnsi="Times New Roman" w:eastAsia="宋体"/>
+                <w:sz w:val="16"/>
+              </w:rPr>
+              <w:t>Macrophage</w:t>
+            </w:r>
+          </w:p>
+        </w:tc>
+        <w:tc>
+          <w:tcPr>
+            <w:tcW w:type="dxa" w:w="1234"/>
+          </w:tcPr>
+          <w:p>
+            <w:r/>
+            <w:r>
+              <w:rPr>
+                <w:rFonts w:ascii="Times New Roman" w:hAnsi="Times New Roman" w:eastAsia="宋体"/>
+                <w:sz w:val="16"/>
+              </w:rPr>
+              <w:t>Myeloid</w:t>
+            </w:r>
+          </w:p>
+        </w:tc>
+        <w:tc>
+          <w:tcPr>
+            <w:tcW w:type="dxa" w:w="1234"/>
+          </w:tcPr>
+          <w:p>
+            <w:r/>
+            <w:r>
+              <w:rPr>
+                <w:rFonts w:ascii="Times New Roman" w:hAnsi="Times New Roman" w:eastAsia="宋体"/>
+                <w:sz w:val="16"/>
+              </w:rPr>
+              <w:t>Myeloid</w:t>
+            </w:r>
+          </w:p>
+        </w:tc>
+        <w:tc>
+          <w:tcPr>
+            <w:tcW w:type="dxa" w:w="1234"/>
+          </w:tcPr>
+          <w:p>
+            <w:r/>
+            <w:r>
+              <w:rPr>
+                <w:rFonts w:ascii="Times New Roman" w:hAnsi="Times New Roman" w:eastAsia="宋体"/>
+                <w:sz w:val="16"/>
+              </w:rPr>
+              <w:t>1.67</w:t>
+            </w:r>
+          </w:p>
+        </w:tc>
+        <w:tc>
+          <w:tcPr>
+            <w:tcW w:type="dxa" w:w="1234"/>
+          </w:tcPr>
+          <w:p>
+            <w:r/>
+            <w:r>
+              <w:rPr>
+                <w:rFonts w:ascii="Times New Roman" w:hAnsi="Times New Roman" w:eastAsia="宋体"/>
+                <w:sz w:val="16"/>
+              </w:rPr>
+              <w:t>Pericyte（0.40）</w:t>
+            </w:r>
+          </w:p>
+        </w:tc>
+        <w:tc>
+          <w:tcPr>
+            <w:tcW w:type="dxa" w:w="1234"/>
+          </w:tcPr>
+          <w:p>
+            <w:r/>
+            <w:r>
+              <w:rPr>
+                <w:rFonts w:ascii="Times New Roman" w:hAnsi="Times New Roman" w:eastAsia="宋体"/>
+                <w:sz w:val="16"/>
+              </w:rPr>
+              <w:t>是</w:t>
+            </w:r>
+          </w:p>
+        </w:tc>
+      </w:tr>
+      <w:tr>
+        <w:tc>
+          <w:tcPr>
+            <w:tcW w:type="dxa" w:w="1234"/>
+          </w:tcPr>
+          <w:p>
+            <w:r/>
+            <w:r>
+              <w:rPr>
+                <w:rFonts w:ascii="Times New Roman" w:hAnsi="Times New Roman" w:eastAsia="宋体"/>
+                <w:sz w:val="16"/>
+              </w:rPr>
+              <w:t>Cd84</w:t>
+            </w:r>
+          </w:p>
+        </w:tc>
+        <w:tc>
+          <w:tcPr>
+            <w:tcW w:type="dxa" w:w="1234"/>
+          </w:tcPr>
+          <w:p>
+            <w:r/>
+            <w:r>
+              <w:rPr>
+                <w:rFonts w:ascii="Times New Roman" w:hAnsi="Times New Roman" w:eastAsia="宋体"/>
+                <w:sz w:val="16"/>
+              </w:rPr>
+              <w:t>Microglia</w:t>
+            </w:r>
+          </w:p>
+        </w:tc>
+        <w:tc>
+          <w:tcPr>
+            <w:tcW w:type="dxa" w:w="1234"/>
+          </w:tcPr>
+          <w:p>
+            <w:r/>
+            <w:r>
+              <w:rPr>
+                <w:rFonts w:ascii="Times New Roman" w:hAnsi="Times New Roman" w:eastAsia="宋体"/>
+                <w:sz w:val="16"/>
+              </w:rPr>
+              <w:t>Myeloid</w:t>
+            </w:r>
+          </w:p>
+        </w:tc>
+        <w:tc>
+          <w:tcPr>
+            <w:tcW w:type="dxa" w:w="1234"/>
+          </w:tcPr>
+          <w:p>
+            <w:r/>
+            <w:r>
+              <w:rPr>
+                <w:rFonts w:ascii="Times New Roman" w:hAnsi="Times New Roman" w:eastAsia="宋体"/>
+                <w:sz w:val="16"/>
+              </w:rPr>
+              <w:t>Myeloid</w:t>
+            </w:r>
+          </w:p>
+        </w:tc>
+        <w:tc>
+          <w:tcPr>
+            <w:tcW w:type="dxa" w:w="1234"/>
+          </w:tcPr>
+          <w:p>
+            <w:r/>
+            <w:r>
+              <w:rPr>
+                <w:rFonts w:ascii="Times New Roman" w:hAnsi="Times New Roman" w:eastAsia="宋体"/>
+                <w:sz w:val="16"/>
+              </w:rPr>
+              <w:t>0.89</w:t>
+            </w:r>
+          </w:p>
+        </w:tc>
+        <w:tc>
+          <w:tcPr>
+            <w:tcW w:type="dxa" w:w="1234"/>
+          </w:tcPr>
+          <w:p>
+            <w:r/>
+            <w:r>
+              <w:rPr>
+                <w:rFonts w:ascii="Times New Roman" w:hAnsi="Times New Roman" w:eastAsia="宋体"/>
+                <w:sz w:val="16"/>
+              </w:rPr>
+              <w:t>T_cell（0.57）</w:t>
+            </w:r>
+          </w:p>
+        </w:tc>
+        <w:tc>
+          <w:tcPr>
+            <w:tcW w:type="dxa" w:w="1234"/>
+          </w:tcPr>
+          <w:p>
+            <w:r/>
+            <w:r>
+              <w:rPr>
+                <w:rFonts w:ascii="Times New Roman" w:hAnsi="Times New Roman" w:eastAsia="宋体"/>
+                <w:sz w:val="16"/>
+              </w:rPr>
+              <w:t>是</w:t>
+            </w:r>
+          </w:p>
+        </w:tc>
+      </w:tr>
+      <w:tr>
+        <w:tc>
+          <w:tcPr>
+            <w:tcW w:type="dxa" w:w="1234"/>
+          </w:tcPr>
+          <w:p>
+            <w:r/>
+            <w:r>
+              <w:rPr>
+                <w:rFonts w:ascii="Times New Roman" w:hAnsi="Times New Roman" w:eastAsia="宋体"/>
+                <w:sz w:val="16"/>
+              </w:rPr>
+              <w:t>Cfh</w:t>
+            </w:r>
+          </w:p>
+        </w:tc>
+        <w:tc>
+          <w:tcPr>
+            <w:tcW w:type="dxa" w:w="1234"/>
+          </w:tcPr>
+          <w:p>
+            <w:r/>
+            <w:r>
+              <w:rPr>
+                <w:rFonts w:ascii="Times New Roman" w:hAnsi="Times New Roman" w:eastAsia="宋体"/>
+                <w:sz w:val="16"/>
+              </w:rPr>
+              <w:t>Microglia</w:t>
+            </w:r>
+          </w:p>
+        </w:tc>
+        <w:tc>
+          <w:tcPr>
+            <w:tcW w:type="dxa" w:w="1234"/>
+          </w:tcPr>
+          <w:p>
+            <w:r/>
+            <w:r>
+              <w:rPr>
+                <w:rFonts w:ascii="Times New Roman" w:hAnsi="Times New Roman" w:eastAsia="宋体"/>
+                <w:sz w:val="16"/>
+              </w:rPr>
+              <w:t>Pericyte</w:t>
+            </w:r>
+          </w:p>
+        </w:tc>
+        <w:tc>
+          <w:tcPr>
+            <w:tcW w:type="dxa" w:w="1234"/>
+          </w:tcPr>
+          <w:p>
+            <w:r/>
+            <w:r>
+              <w:rPr>
+                <w:rFonts w:ascii="Times New Roman" w:hAnsi="Times New Roman" w:eastAsia="宋体"/>
+                <w:sz w:val="16"/>
+              </w:rPr>
+              <w:t>Pericyte</w:t>
+            </w:r>
+          </w:p>
+        </w:tc>
+        <w:tc>
+          <w:tcPr>
+            <w:tcW w:type="dxa" w:w="1234"/>
+          </w:tcPr>
+          <w:p>
+            <w:r/>
+            <w:r>
+              <w:rPr>
+                <w:rFonts w:ascii="Times New Roman" w:hAnsi="Times New Roman" w:eastAsia="宋体"/>
+                <w:sz w:val="16"/>
+              </w:rPr>
+              <w:t>0.56</w:t>
+            </w:r>
+          </w:p>
+        </w:tc>
+        <w:tc>
+          <w:tcPr>
+            <w:tcW w:type="dxa" w:w="1234"/>
+          </w:tcPr>
+          <w:p>
+            <w:r/>
+            <w:r>
+              <w:rPr>
+                <w:rFonts w:ascii="Times New Roman" w:hAnsi="Times New Roman" w:eastAsia="宋体"/>
+                <w:sz w:val="16"/>
+              </w:rPr>
+              <w:t>Pericyte（0.59）</w:t>
+            </w:r>
+          </w:p>
+        </w:tc>
+        <w:tc>
+          <w:tcPr>
+            <w:tcW w:type="dxa" w:w="1234"/>
+          </w:tcPr>
+          <w:p>
+            <w:r/>
+            <w:r>
+              <w:rPr>
+                <w:rFonts w:ascii="Times New Roman" w:hAnsi="Times New Roman" w:eastAsia="宋体"/>
+                <w:sz w:val="16"/>
+              </w:rPr>
+              <w:t>否</w:t>
+            </w:r>
+          </w:p>
+        </w:tc>
+      </w:tr>
+      <w:tr>
+        <w:tc>
+          <w:tcPr>
+            <w:tcW w:type="dxa" w:w="1234"/>
+          </w:tcPr>
+          <w:p>
+            <w:r/>
+            <w:r>
+              <w:rPr>
+                <w:rFonts w:ascii="Times New Roman" w:hAnsi="Times New Roman" w:eastAsia="宋体"/>
+                <w:sz w:val="16"/>
+              </w:rPr>
+              <w:t>Nrp1</w:t>
+            </w:r>
+          </w:p>
+        </w:tc>
+        <w:tc>
+          <w:tcPr>
+            <w:tcW w:type="dxa" w:w="1234"/>
+          </w:tcPr>
+          <w:p>
+            <w:r/>
+            <w:r>
+              <w:rPr>
+                <w:rFonts w:ascii="Times New Roman" w:hAnsi="Times New Roman" w:eastAsia="宋体"/>
+                <w:sz w:val="16"/>
+              </w:rPr>
+              <w:t>Microglia</w:t>
+            </w:r>
+          </w:p>
+        </w:tc>
+        <w:tc>
+          <w:tcPr>
+            <w:tcW w:type="dxa" w:w="1234"/>
+          </w:tcPr>
+          <w:p>
+            <w:r/>
+            <w:r>
+              <w:rPr>
+                <w:rFonts w:ascii="Times New Roman" w:hAnsi="Times New Roman" w:eastAsia="宋体"/>
+                <w:sz w:val="16"/>
+              </w:rPr>
+              <w:t>Endothelial</w:t>
+            </w:r>
+          </w:p>
+        </w:tc>
+        <w:tc>
+          <w:tcPr>
+            <w:tcW w:type="dxa" w:w="1234"/>
+          </w:tcPr>
+          <w:p>
+            <w:r/>
+            <w:r>
+              <w:rPr>
+                <w:rFonts w:ascii="Times New Roman" w:hAnsi="Times New Roman" w:eastAsia="宋体"/>
+                <w:sz w:val="16"/>
+              </w:rPr>
+              <w:t>Endothelial</w:t>
+            </w:r>
+          </w:p>
+        </w:tc>
+        <w:tc>
+          <w:tcPr>
+            <w:tcW w:type="dxa" w:w="1234"/>
+          </w:tcPr>
+          <w:p>
+            <w:r/>
+            <w:r>
+              <w:rPr>
+                <w:rFonts w:ascii="Times New Roman" w:hAnsi="Times New Roman" w:eastAsia="宋体"/>
+                <w:sz w:val="16"/>
+              </w:rPr>
+              <w:t>0.54</w:t>
+            </w:r>
+          </w:p>
+        </w:tc>
+        <w:tc>
+          <w:tcPr>
+            <w:tcW w:type="dxa" w:w="1234"/>
+          </w:tcPr>
+          <w:p>
+            <w:r/>
+            <w:r>
+              <w:rPr>
+                <w:rFonts w:ascii="Times New Roman" w:hAnsi="Times New Roman" w:eastAsia="宋体"/>
+                <w:sz w:val="16"/>
+              </w:rPr>
+              <w:t>Endothelial（0.62）</w:t>
+            </w:r>
+          </w:p>
+        </w:tc>
+        <w:tc>
+          <w:tcPr>
+            <w:tcW w:type="dxa" w:w="1234"/>
+          </w:tcPr>
+          <w:p>
+            <w:r/>
+            <w:r>
+              <w:rPr>
+                <w:rFonts w:ascii="Times New Roman" w:hAnsi="Times New Roman" w:eastAsia="宋体"/>
+                <w:sz w:val="16"/>
+              </w:rPr>
+              <w:t>否</w:t>
+            </w:r>
+          </w:p>
+        </w:tc>
+      </w:tr>
+      <w:tr>
+        <w:tc>
+          <w:tcPr>
+            <w:tcW w:type="dxa" w:w="1234"/>
+          </w:tcPr>
+          <w:p>
+            <w:r/>
+            <w:r>
+              <w:rPr>
+                <w:rFonts w:ascii="Times New Roman" w:hAnsi="Times New Roman" w:eastAsia="宋体"/>
+                <w:sz w:val="16"/>
+              </w:rPr>
+              <w:t>Lmo2</w:t>
+            </w:r>
+          </w:p>
+        </w:tc>
+        <w:tc>
+          <w:tcPr>
+            <w:tcW w:type="dxa" w:w="1234"/>
+          </w:tcPr>
+          <w:p>
+            <w:r/>
+            <w:r>
+              <w:rPr>
+                <w:rFonts w:ascii="Times New Roman" w:hAnsi="Times New Roman" w:eastAsia="宋体"/>
+                <w:sz w:val="16"/>
+              </w:rPr>
+              <w:t>Microglia</w:t>
+            </w:r>
+          </w:p>
+        </w:tc>
+        <w:tc>
+          <w:tcPr>
+            <w:tcW w:type="dxa" w:w="1234"/>
+          </w:tcPr>
+          <w:p>
+            <w:r/>
+            <w:r>
+              <w:rPr>
+                <w:rFonts w:ascii="Times New Roman" w:hAnsi="Times New Roman" w:eastAsia="宋体"/>
+                <w:sz w:val="16"/>
+              </w:rPr>
+              <w:t>Endothelial</w:t>
+            </w:r>
+          </w:p>
+        </w:tc>
+        <w:tc>
+          <w:tcPr>
+            <w:tcW w:type="dxa" w:w="1234"/>
+          </w:tcPr>
+          <w:p>
+            <w:r/>
+            <w:r>
+              <w:rPr>
+                <w:rFonts w:ascii="Times New Roman" w:hAnsi="Times New Roman" w:eastAsia="宋体"/>
+                <w:sz w:val="16"/>
+              </w:rPr>
+              <w:t>Endothelial</w:t>
+            </w:r>
+          </w:p>
+        </w:tc>
+        <w:tc>
+          <w:tcPr>
+            <w:tcW w:type="dxa" w:w="1234"/>
+          </w:tcPr>
+          <w:p>
+            <w:r/>
+            <w:r>
+              <w:rPr>
+                <w:rFonts w:ascii="Times New Roman" w:hAnsi="Times New Roman" w:eastAsia="宋体"/>
+                <w:sz w:val="16"/>
+              </w:rPr>
+              <w:t>0.54</w:t>
+            </w:r>
+          </w:p>
+        </w:tc>
+        <w:tc>
+          <w:tcPr>
+            <w:tcW w:type="dxa" w:w="1234"/>
+          </w:tcPr>
+          <w:p>
+            <w:r/>
+            <w:r>
+              <w:rPr>
+                <w:rFonts w:ascii="Times New Roman" w:hAnsi="Times New Roman" w:eastAsia="宋体"/>
+                <w:sz w:val="16"/>
+              </w:rPr>
+              <w:t>Endothelial（0.63）</w:t>
+            </w:r>
+          </w:p>
+        </w:tc>
+        <w:tc>
+          <w:tcPr>
+            <w:tcW w:type="dxa" w:w="1234"/>
+          </w:tcPr>
+          <w:p>
+            <w:r/>
+            <w:r>
+              <w:rPr>
+                <w:rFonts w:ascii="Times New Roman" w:hAnsi="Times New Roman" w:eastAsia="宋体"/>
+                <w:sz w:val="16"/>
+              </w:rPr>
+              <w:t>否</w:t>
+            </w:r>
+          </w:p>
+        </w:tc>
+      </w:tr>
+      <w:tr>
+        <w:tc>
+          <w:tcPr>
+            <w:tcW w:type="dxa" w:w="1234"/>
+          </w:tcPr>
+          <w:p>
+            <w:r/>
+            <w:r>
+              <w:rPr>
+                <w:rFonts w:ascii="Times New Roman" w:hAnsi="Times New Roman" w:eastAsia="宋体"/>
+                <w:sz w:val="16"/>
+              </w:rPr>
+              <w:t>Klhl6</w:t>
+            </w:r>
+          </w:p>
+        </w:tc>
+        <w:tc>
+          <w:tcPr>
+            <w:tcW w:type="dxa" w:w="1234"/>
+          </w:tcPr>
+          <w:p>
+            <w:r/>
+            <w:r>
+              <w:rPr>
+                <w:rFonts w:ascii="Times New Roman" w:hAnsi="Times New Roman" w:eastAsia="宋体"/>
+                <w:sz w:val="16"/>
+              </w:rPr>
+              <w:t>B_cell</w:t>
+            </w:r>
+          </w:p>
+        </w:tc>
+        <w:tc>
+          <w:tcPr>
+            <w:tcW w:type="dxa" w:w="1234"/>
+          </w:tcPr>
+          <w:p>
+            <w:r/>
+            <w:r>
+              <w:rPr>
+                <w:rFonts w:ascii="Times New Roman" w:hAnsi="Times New Roman" w:eastAsia="宋体"/>
+                <w:sz w:val="16"/>
+              </w:rPr>
+              <w:t>B_cell</w:t>
+            </w:r>
+          </w:p>
+        </w:tc>
+        <w:tc>
+          <w:tcPr>
+            <w:tcW w:type="dxa" w:w="1234"/>
+          </w:tcPr>
+          <w:p>
+            <w:r/>
+            <w:r>
+              <w:rPr>
+                <w:rFonts w:ascii="Times New Roman" w:hAnsi="Times New Roman" w:eastAsia="宋体"/>
+                <w:sz w:val="16"/>
+              </w:rPr>
+              <w:t>B_cell</w:t>
+            </w:r>
+          </w:p>
+        </w:tc>
+        <w:tc>
+          <w:tcPr>
+            <w:tcW w:type="dxa" w:w="1234"/>
+          </w:tcPr>
+          <w:p>
+            <w:r/>
+            <w:r>
+              <w:rPr>
+                <w:rFonts w:ascii="Times New Roman" w:hAnsi="Times New Roman" w:eastAsia="宋体"/>
+                <w:sz w:val="16"/>
+              </w:rPr>
+              <w:t>0.28</w:t>
+            </w:r>
+          </w:p>
+        </w:tc>
+        <w:tc>
+          <w:tcPr>
+            <w:tcW w:type="dxa" w:w="1234"/>
+          </w:tcPr>
+          <w:p>
+            <w:r/>
+            <w:r>
+              <w:rPr>
+                <w:rFonts w:ascii="Times New Roman" w:hAnsi="Times New Roman" w:eastAsia="宋体"/>
+                <w:sz w:val="16"/>
+              </w:rPr>
+              <w:t>B_cell（0.54）</w:t>
+            </w:r>
+          </w:p>
+        </w:tc>
+        <w:tc>
+          <w:tcPr>
+            <w:tcW w:type="dxa" w:w="1234"/>
+          </w:tcPr>
+          <w:p>
+            <w:r/>
+            <w:r>
+              <w:rPr>
+                <w:rFonts w:ascii="Times New Roman" w:hAnsi="Times New Roman" w:eastAsia="宋体"/>
+                <w:sz w:val="16"/>
+              </w:rPr>
+              <w:t>否</w:t>
+            </w:r>
+          </w:p>
+        </w:tc>
+      </w:tr>
+      <w:tr>
+        <w:tc>
+          <w:tcPr>
+            <w:tcW w:type="dxa" w:w="1234"/>
+          </w:tcPr>
+          <w:p>
+            <w:r/>
+            <w:r>
+              <w:rPr>
+                <w:rFonts w:ascii="Times New Roman" w:hAnsi="Times New Roman" w:eastAsia="宋体"/>
+                <w:sz w:val="16"/>
+              </w:rPr>
+              <w:t>Fbxw4</w:t>
+            </w:r>
+          </w:p>
+        </w:tc>
+        <w:tc>
+          <w:tcPr>
+            <w:tcW w:type="dxa" w:w="1234"/>
+          </w:tcPr>
+          <w:p>
+            <w:r/>
+            <w:r>
+              <w:rPr>
+                <w:rFonts w:ascii="Times New Roman" w:hAnsi="Times New Roman" w:eastAsia="宋体"/>
+                <w:sz w:val="16"/>
+              </w:rPr>
+              <w:t>Microglia</w:t>
+            </w:r>
+          </w:p>
+        </w:tc>
+        <w:tc>
+          <w:tcPr>
+            <w:tcW w:type="dxa" w:w="1234"/>
+          </w:tcPr>
+          <w:p>
+            <w:r/>
+            <w:r>
+              <w:rPr>
+                <w:rFonts w:ascii="Times New Roman" w:hAnsi="Times New Roman" w:eastAsia="宋体"/>
+                <w:sz w:val="16"/>
+              </w:rPr>
+              <w:t>Myeloid</w:t>
+            </w:r>
+          </w:p>
+        </w:tc>
+        <w:tc>
+          <w:tcPr>
+            <w:tcW w:type="dxa" w:w="1234"/>
+          </w:tcPr>
+          <w:p>
+            <w:r/>
+            <w:r>
+              <w:rPr>
+                <w:rFonts w:ascii="Times New Roman" w:hAnsi="Times New Roman" w:eastAsia="宋体"/>
+                <w:sz w:val="16"/>
+              </w:rPr>
+              <w:t>Myeloid</w:t>
+            </w:r>
+          </w:p>
+        </w:tc>
+        <w:tc>
+          <w:tcPr>
+            <w:tcW w:type="dxa" w:w="1234"/>
+          </w:tcPr>
+          <w:p>
+            <w:r/>
+            <w:r>
+              <w:rPr>
+                <w:rFonts w:ascii="Times New Roman" w:hAnsi="Times New Roman" w:eastAsia="宋体"/>
+                <w:sz w:val="16"/>
+              </w:rPr>
+              <w:t>0.24</w:t>
+            </w:r>
+          </w:p>
+        </w:tc>
+        <w:tc>
+          <w:tcPr>
+            <w:tcW w:type="dxa" w:w="1234"/>
+          </w:tcPr>
+          <w:p>
+            <w:r/>
+            <w:r>
+              <w:rPr>
+                <w:rFonts w:ascii="Times New Roman" w:hAnsi="Times New Roman" w:eastAsia="宋体"/>
+                <w:sz w:val="16"/>
+              </w:rPr>
+              <w:t>T_cell（0.12）</w:t>
+            </w:r>
+          </w:p>
+        </w:tc>
+        <w:tc>
+          <w:tcPr>
+            <w:tcW w:type="dxa" w:w="1234"/>
+          </w:tcPr>
+          <w:p>
+            <w:r/>
+            <w:r>
+              <w:rPr>
+                <w:rFonts w:ascii="Times New Roman" w:hAnsi="Times New Roman" w:eastAsia="宋体"/>
+                <w:sz w:val="16"/>
+              </w:rPr>
+              <w:t>是</w:t>
+            </w:r>
+          </w:p>
+        </w:tc>
+      </w:tr>
+      <w:tr>
+        <w:tc>
+          <w:tcPr>
+            <w:tcW w:type="dxa" w:w="1234"/>
+          </w:tcPr>
+          <w:p>
+            <w:r/>
+            <w:r>
+              <w:rPr>
+                <w:rFonts w:ascii="Times New Roman" w:hAnsi="Times New Roman" w:eastAsia="宋体"/>
+                <w:sz w:val="16"/>
+              </w:rPr>
+              <w:t>Arhgap25</w:t>
+            </w:r>
+          </w:p>
+        </w:tc>
+        <w:tc>
+          <w:tcPr>
+            <w:tcW w:type="dxa" w:w="1234"/>
+          </w:tcPr>
+          <w:p>
+            <w:r/>
+            <w:r>
+              <w:rPr>
+                <w:rFonts w:ascii="Times New Roman" w:hAnsi="Times New Roman" w:eastAsia="宋体"/>
+                <w:sz w:val="16"/>
+              </w:rPr>
+              <w:t>Microglia</w:t>
+            </w:r>
+          </w:p>
+        </w:tc>
+        <w:tc>
+          <w:tcPr>
+            <w:tcW w:type="dxa" w:w="1234"/>
+          </w:tcPr>
+          <w:p>
+            <w:r/>
+            <w:r>
+              <w:rPr>
+                <w:rFonts w:ascii="Times New Roman" w:hAnsi="Times New Roman" w:eastAsia="宋体"/>
+                <w:sz w:val="16"/>
+              </w:rPr>
+              <w:t>B_cell</w:t>
+            </w:r>
+          </w:p>
+        </w:tc>
+        <w:tc>
+          <w:tcPr>
+            <w:tcW w:type="dxa" w:w="1234"/>
+          </w:tcPr>
+          <w:p>
+            <w:r/>
+            <w:r>
+              <w:rPr>
+                <w:rFonts w:ascii="Times New Roman" w:hAnsi="Times New Roman" w:eastAsia="宋体"/>
+                <w:sz w:val="16"/>
+              </w:rPr>
+              <w:t>B_cell</w:t>
+            </w:r>
+          </w:p>
+        </w:tc>
+        <w:tc>
+          <w:tcPr>
+            <w:tcW w:type="dxa" w:w="1234"/>
+          </w:tcPr>
+          <w:p>
+            <w:r/>
+            <w:r>
+              <w:rPr>
+                <w:rFonts w:ascii="Times New Roman" w:hAnsi="Times New Roman" w:eastAsia="宋体"/>
+                <w:sz w:val="16"/>
+              </w:rPr>
+              <w:t>0.24</w:t>
+            </w:r>
+          </w:p>
+        </w:tc>
+        <w:tc>
+          <w:tcPr>
+            <w:tcW w:type="dxa" w:w="1234"/>
+          </w:tcPr>
+          <w:p>
+            <w:r/>
+            <w:r>
+              <w:rPr>
+                <w:rFonts w:ascii="Times New Roman" w:hAnsi="Times New Roman" w:eastAsia="宋体"/>
+                <w:sz w:val="16"/>
+              </w:rPr>
+              <w:t>B_cell（0.27）</w:t>
+            </w:r>
+          </w:p>
+        </w:tc>
+        <w:tc>
+          <w:tcPr>
+            <w:tcW w:type="dxa" w:w="1234"/>
+          </w:tcPr>
+          <w:p>
+            <w:r/>
+            <w:r>
+              <w:rPr>
+                <w:rFonts w:ascii="Times New Roman" w:hAnsi="Times New Roman" w:eastAsia="宋体"/>
+                <w:sz w:val="16"/>
+              </w:rPr>
+              <w:t>否</w:t>
+            </w:r>
+          </w:p>
+        </w:tc>
+      </w:tr>
+      <w:tr>
+        <w:tc>
+          <w:tcPr>
+            <w:tcW w:type="dxa" w:w="1234"/>
+          </w:tcPr>
+          <w:p>
+            <w:r/>
+            <w:r>
+              <w:rPr>
+                <w:rFonts w:ascii="Times New Roman" w:hAnsi="Times New Roman" w:eastAsia="宋体"/>
+                <w:sz w:val="16"/>
+              </w:rPr>
+              <w:t>Rassf3</w:t>
+            </w:r>
+          </w:p>
+        </w:tc>
+        <w:tc>
+          <w:tcPr>
+            <w:tcW w:type="dxa" w:w="1234"/>
+          </w:tcPr>
+          <w:p>
+            <w:r/>
+            <w:r>
+              <w:rPr>
+                <w:rFonts w:ascii="Times New Roman" w:hAnsi="Times New Roman" w:eastAsia="宋体"/>
+                <w:sz w:val="16"/>
+              </w:rPr>
+              <w:t>Neutrophil</w:t>
+            </w:r>
+          </w:p>
+        </w:tc>
+        <w:tc>
+          <w:tcPr>
+            <w:tcW w:type="dxa" w:w="1234"/>
+          </w:tcPr>
+          <w:p>
+            <w:r/>
+            <w:r>
+              <w:rPr>
+                <w:rFonts w:ascii="Times New Roman" w:hAnsi="Times New Roman" w:eastAsia="宋体"/>
+                <w:sz w:val="16"/>
+              </w:rPr>
+              <w:t>Myeloid</w:t>
+            </w:r>
+          </w:p>
+        </w:tc>
+        <w:tc>
+          <w:tcPr>
+            <w:tcW w:type="dxa" w:w="1234"/>
+          </w:tcPr>
+          <w:p>
+            <w:r/>
+            <w:r>
+              <w:rPr>
+                <w:rFonts w:ascii="Times New Roman" w:hAnsi="Times New Roman" w:eastAsia="宋体"/>
+                <w:sz w:val="16"/>
+              </w:rPr>
+              <w:t>Myeloid</w:t>
+            </w:r>
+          </w:p>
+        </w:tc>
+        <w:tc>
+          <w:tcPr>
+            <w:tcW w:type="dxa" w:w="1234"/>
+          </w:tcPr>
+          <w:p>
+            <w:r/>
+            <w:r>
+              <w:rPr>
+                <w:rFonts w:ascii="Times New Roman" w:hAnsi="Times New Roman" w:eastAsia="宋体"/>
+                <w:sz w:val="16"/>
+              </w:rPr>
+              <w:t>0.20</w:t>
+            </w:r>
+          </w:p>
+        </w:tc>
+        <w:tc>
+          <w:tcPr>
+            <w:tcW w:type="dxa" w:w="1234"/>
+          </w:tcPr>
+          <w:p>
+            <w:r/>
+            <w:r>
+              <w:rPr>
+                <w:rFonts w:ascii="Times New Roman" w:hAnsi="Times New Roman" w:eastAsia="宋体"/>
+                <w:sz w:val="16"/>
+              </w:rPr>
+              <w:t>Endothelial（0.15）</w:t>
+            </w:r>
+          </w:p>
+        </w:tc>
+        <w:tc>
+          <w:tcPr>
+            <w:tcW w:type="dxa" w:w="1234"/>
+          </w:tcPr>
+          <w:p>
+            <w:r/>
+            <w:r>
+              <w:rPr>
+                <w:rFonts w:ascii="Times New Roman" w:hAnsi="Times New Roman" w:eastAsia="宋体"/>
+                <w:sz w:val="16"/>
+              </w:rPr>
+              <w:t>是</w:t>
+            </w:r>
+          </w:p>
+        </w:tc>
+      </w:tr>
+      <w:tr>
+        <w:tc>
+          <w:tcPr>
+            <w:tcW w:type="dxa" w:w="1234"/>
+          </w:tcPr>
+          <w:p>
+            <w:r/>
+            <w:r>
+              <w:rPr>
+                <w:rFonts w:ascii="Times New Roman" w:hAnsi="Times New Roman" w:eastAsia="宋体"/>
+                <w:sz w:val="16"/>
+              </w:rPr>
+              <w:t>Zc3h12a</w:t>
+            </w:r>
+          </w:p>
+        </w:tc>
+        <w:tc>
+          <w:tcPr>
+            <w:tcW w:type="dxa" w:w="1234"/>
+          </w:tcPr>
+          <w:p>
+            <w:r/>
+            <w:r>
+              <w:rPr>
+                <w:rFonts w:ascii="Times New Roman" w:hAnsi="Times New Roman" w:eastAsia="宋体"/>
+                <w:sz w:val="16"/>
+              </w:rPr>
+              <w:t>Neutrophil</w:t>
+            </w:r>
+          </w:p>
+        </w:tc>
+        <w:tc>
+          <w:tcPr>
+            <w:tcW w:type="dxa" w:w="1234"/>
+          </w:tcPr>
+          <w:p>
+            <w:r/>
+            <w:r>
+              <w:rPr>
+                <w:rFonts w:ascii="Times New Roman" w:hAnsi="Times New Roman" w:eastAsia="宋体"/>
+                <w:sz w:val="16"/>
+              </w:rPr>
+              <w:t>Myeloid</w:t>
+            </w:r>
+          </w:p>
+        </w:tc>
+        <w:tc>
+          <w:tcPr>
+            <w:tcW w:type="dxa" w:w="1234"/>
+          </w:tcPr>
+          <w:p>
+            <w:r/>
+            <w:r>
+              <w:rPr>
+                <w:rFonts w:ascii="Times New Roman" w:hAnsi="Times New Roman" w:eastAsia="宋体"/>
+                <w:sz w:val="16"/>
+              </w:rPr>
+              <w:t>Myeloid</w:t>
+            </w:r>
+          </w:p>
+        </w:tc>
+        <w:tc>
+          <w:tcPr>
+            <w:tcW w:type="dxa" w:w="1234"/>
+          </w:tcPr>
+          <w:p>
+            <w:r/>
+            <w:r>
+              <w:rPr>
+                <w:rFonts w:ascii="Times New Roman" w:hAnsi="Times New Roman" w:eastAsia="宋体"/>
+                <w:sz w:val="16"/>
+              </w:rPr>
+              <w:t>0.13</w:t>
+            </w:r>
+          </w:p>
+        </w:tc>
+        <w:tc>
+          <w:tcPr>
+            <w:tcW w:type="dxa" w:w="1234"/>
+          </w:tcPr>
+          <w:p>
+            <w:r/>
+            <w:r>
+              <w:rPr>
+                <w:rFonts w:ascii="Times New Roman" w:hAnsi="Times New Roman" w:eastAsia="宋体"/>
+                <w:sz w:val="16"/>
+              </w:rPr>
+              <w:t>B_cell（0.10）</w:t>
+            </w:r>
+          </w:p>
+        </w:tc>
+        <w:tc>
+          <w:tcPr>
+            <w:tcW w:type="dxa" w:w="1234"/>
+          </w:tcPr>
+          <w:p>
+            <w:r/>
+            <w:r>
+              <w:rPr>
+                <w:rFonts w:ascii="Times New Roman" w:hAnsi="Times New Roman" w:eastAsia="宋体"/>
+                <w:sz w:val="16"/>
+              </w:rPr>
+              <w:t>是</w:t>
+            </w:r>
+          </w:p>
+        </w:tc>
+      </w:tr>
+      <w:tr>
+        <w:tc>
+          <w:tcPr>
+            <w:tcW w:type="dxa" w:w="1234"/>
+          </w:tcPr>
+          <w:p>
+            <w:r/>
+            <w:r>
+              <w:rPr>
+                <w:rFonts w:ascii="Times New Roman" w:hAnsi="Times New Roman" w:eastAsia="宋体"/>
+                <w:sz w:val="16"/>
+              </w:rPr>
+              <w:t>Man2b2</w:t>
+            </w:r>
+          </w:p>
+        </w:tc>
+        <w:tc>
+          <w:tcPr>
+            <w:tcW w:type="dxa" w:w="1234"/>
+          </w:tcPr>
+          <w:p>
+            <w:r/>
+            <w:r>
+              <w:rPr>
+                <w:rFonts w:ascii="Times New Roman" w:hAnsi="Times New Roman" w:eastAsia="宋体"/>
+                <w:sz w:val="16"/>
+              </w:rPr>
+              <w:t>Microglia</w:t>
+            </w:r>
+          </w:p>
+        </w:tc>
+        <w:tc>
+          <w:tcPr>
+            <w:tcW w:type="dxa" w:w="1234"/>
+          </w:tcPr>
+          <w:p>
+            <w:r/>
+            <w:r>
+              <w:rPr>
+                <w:rFonts w:ascii="Times New Roman" w:hAnsi="Times New Roman" w:eastAsia="宋体"/>
+                <w:sz w:val="16"/>
+              </w:rPr>
+              <w:t>Myeloid</w:t>
+            </w:r>
+          </w:p>
+        </w:tc>
+        <w:tc>
+          <w:tcPr>
+            <w:tcW w:type="dxa" w:w="1234"/>
+          </w:tcPr>
+          <w:p>
+            <w:r/>
+            <w:r>
+              <w:rPr>
+                <w:rFonts w:ascii="Times New Roman" w:hAnsi="Times New Roman" w:eastAsia="宋体"/>
+                <w:sz w:val="16"/>
+              </w:rPr>
+              <w:t>Myeloid</w:t>
+            </w:r>
+          </w:p>
+        </w:tc>
+        <w:tc>
+          <w:tcPr>
+            <w:tcW w:type="dxa" w:w="1234"/>
+          </w:tcPr>
+          <w:p>
+            <w:r/>
+            <w:r>
+              <w:rPr>
+                <w:rFonts w:ascii="Times New Roman" w:hAnsi="Times New Roman" w:eastAsia="宋体"/>
+                <w:sz w:val="16"/>
+              </w:rPr>
+              <w:t>0.10</w:t>
+            </w:r>
+          </w:p>
+        </w:tc>
+        <w:tc>
+          <w:tcPr>
+            <w:tcW w:type="dxa" w:w="1234"/>
+          </w:tcPr>
+          <w:p>
+            <w:r/>
+            <w:r>
+              <w:rPr>
+                <w:rFonts w:ascii="Times New Roman" w:hAnsi="Times New Roman" w:eastAsia="宋体"/>
+                <w:sz w:val="16"/>
+              </w:rPr>
+              <w:t>T_cell（0.05）</w:t>
+            </w:r>
+          </w:p>
+        </w:tc>
+        <w:tc>
+          <w:tcPr>
+            <w:tcW w:type="dxa" w:w="1234"/>
+          </w:tcPr>
+          <w:p>
+            <w:r/>
+            <w:r>
+              <w:rPr>
+                <w:rFonts w:ascii="Times New Roman" w:hAnsi="Times New Roman" w:eastAsia="宋体"/>
+                <w:sz w:val="16"/>
+              </w:rPr>
+              <w:t>是</w:t>
+            </w:r>
+          </w:p>
+        </w:tc>
+      </w:tr>
+      <w:tr>
+        <w:tc>
+          <w:tcPr>
+            <w:tcW w:type="dxa" w:w="1234"/>
+          </w:tcPr>
+          <w:p>
+            <w:r/>
+            <w:r>
+              <w:rPr>
+                <w:rFonts w:ascii="Times New Roman" w:hAnsi="Times New Roman" w:eastAsia="宋体"/>
+                <w:sz w:val="16"/>
+              </w:rPr>
+              <w:t>Mrpl10</w:t>
+            </w:r>
+          </w:p>
+        </w:tc>
+        <w:tc>
+          <w:tcPr>
+            <w:tcW w:type="dxa" w:w="1234"/>
+          </w:tcPr>
+          <w:p>
+            <w:r/>
+            <w:r>
+              <w:rPr>
+                <w:rFonts w:ascii="Times New Roman" w:hAnsi="Times New Roman" w:eastAsia="宋体"/>
+                <w:sz w:val="16"/>
+              </w:rPr>
+              <w:t>Ependymal</w:t>
+            </w:r>
+          </w:p>
+        </w:tc>
+        <w:tc>
+          <w:tcPr>
+            <w:tcW w:type="dxa" w:w="1234"/>
+          </w:tcPr>
+          <w:p>
+            <w:r/>
+            <w:r>
+              <w:rPr>
+                <w:rFonts w:ascii="Times New Roman" w:hAnsi="Times New Roman" w:eastAsia="宋体"/>
+                <w:sz w:val="16"/>
+              </w:rPr>
+              <w:t>Ependymal</w:t>
+            </w:r>
+          </w:p>
+        </w:tc>
+        <w:tc>
+          <w:tcPr>
+            <w:tcW w:type="dxa" w:w="1234"/>
+          </w:tcPr>
+          <w:p>
+            <w:r/>
+            <w:r>
+              <w:rPr>
+                <w:rFonts w:ascii="Times New Roman" w:hAnsi="Times New Roman" w:eastAsia="宋体"/>
+                <w:sz w:val="16"/>
+              </w:rPr>
+              <w:t>Ependymal</w:t>
+            </w:r>
+          </w:p>
+        </w:tc>
+        <w:tc>
+          <w:tcPr>
+            <w:tcW w:type="dxa" w:w="1234"/>
+          </w:tcPr>
+          <w:p>
+            <w:r/>
+            <w:r>
+              <w:rPr>
+                <w:rFonts w:ascii="Times New Roman" w:hAnsi="Times New Roman" w:eastAsia="宋体"/>
+                <w:sz w:val="16"/>
+              </w:rPr>
+              <w:t>0.09</w:t>
+            </w:r>
+          </w:p>
+        </w:tc>
+        <w:tc>
+          <w:tcPr>
+            <w:tcW w:type="dxa" w:w="1234"/>
+          </w:tcPr>
+          <w:p>
+            <w:r/>
+            <w:r>
+              <w:rPr>
+                <w:rFonts w:ascii="Times New Roman" w:hAnsi="Times New Roman" w:eastAsia="宋体"/>
+                <w:sz w:val="16"/>
+              </w:rPr>
+              <w:t>Ependymal（0.18）</w:t>
+            </w:r>
+          </w:p>
+        </w:tc>
+        <w:tc>
+          <w:tcPr>
+            <w:tcW w:type="dxa" w:w="1234"/>
+          </w:tcPr>
+          <w:p>
+            <w:r/>
+            <w:r>
+              <w:rPr>
+                <w:rFonts w:ascii="Times New Roman" w:hAnsi="Times New Roman" w:eastAsia="宋体"/>
+                <w:sz w:val="16"/>
+              </w:rPr>
+              <w:t>否</w:t>
+            </w:r>
+          </w:p>
+        </w:tc>
+      </w:tr>
+      <w:tr>
+        <w:tc>
+          <w:tcPr>
+            <w:tcW w:type="dxa" w:w="1234"/>
+          </w:tcPr>
+          <w:p>
+            <w:r/>
+            <w:r>
+              <w:rPr>
+                <w:rFonts w:ascii="Times New Roman" w:hAnsi="Times New Roman" w:eastAsia="宋体"/>
+                <w:sz w:val="16"/>
+              </w:rPr>
+              <w:t>Rfx7</w:t>
+            </w:r>
+          </w:p>
+        </w:tc>
+        <w:tc>
+          <w:tcPr>
+            <w:tcW w:type="dxa" w:w="1234"/>
+          </w:tcPr>
+          <w:p>
+            <w:r/>
+            <w:r>
+              <w:rPr>
+                <w:rFonts w:ascii="Times New Roman" w:hAnsi="Times New Roman" w:eastAsia="宋体"/>
+                <w:sz w:val="16"/>
+              </w:rPr>
+              <w:t>B_cell</w:t>
+            </w:r>
+          </w:p>
+        </w:tc>
+        <w:tc>
+          <w:tcPr>
+            <w:tcW w:type="dxa" w:w="1234"/>
+          </w:tcPr>
+          <w:p>
+            <w:r/>
+            <w:r>
+              <w:rPr>
+                <w:rFonts w:ascii="Times New Roman" w:hAnsi="Times New Roman" w:eastAsia="宋体"/>
+                <w:sz w:val="16"/>
+              </w:rPr>
+              <w:t>B_cell</w:t>
+            </w:r>
+          </w:p>
+        </w:tc>
+        <w:tc>
+          <w:tcPr>
+            <w:tcW w:type="dxa" w:w="1234"/>
+          </w:tcPr>
+          <w:p>
+            <w:r/>
+            <w:r>
+              <w:rPr>
+                <w:rFonts w:ascii="Times New Roman" w:hAnsi="Times New Roman" w:eastAsia="宋体"/>
+                <w:sz w:val="16"/>
+              </w:rPr>
+              <w:t>B_cell</w:t>
+            </w:r>
+          </w:p>
+        </w:tc>
+        <w:tc>
+          <w:tcPr>
+            <w:tcW w:type="dxa" w:w="1234"/>
+          </w:tcPr>
+          <w:p>
+            <w:r/>
+            <w:r>
+              <w:rPr>
+                <w:rFonts w:ascii="Times New Roman" w:hAnsi="Times New Roman" w:eastAsia="宋体"/>
+                <w:sz w:val="16"/>
+              </w:rPr>
+              <w:t>0.06</w:t>
+            </w:r>
+          </w:p>
+        </w:tc>
+        <w:tc>
+          <w:tcPr>
+            <w:tcW w:type="dxa" w:w="1234"/>
+          </w:tcPr>
+          <w:p>
+            <w:r/>
+            <w:r>
+              <w:rPr>
+                <w:rFonts w:ascii="Times New Roman" w:hAnsi="Times New Roman" w:eastAsia="宋体"/>
+                <w:sz w:val="16"/>
+              </w:rPr>
+              <w:t>B_cell（0.20）</w:t>
+            </w:r>
+          </w:p>
+        </w:tc>
+        <w:tc>
+          <w:tcPr>
+            <w:tcW w:type="dxa" w:w="1234"/>
+          </w:tcPr>
+          <w:p>
+            <w:r/>
+            <w:r>
+              <w:rPr>
+                <w:rFonts w:ascii="Times New Roman" w:hAnsi="Times New Roman" w:eastAsia="宋体"/>
+                <w:sz w:val="16"/>
+              </w:rPr>
+              <w:t>否</w:t>
+            </w:r>
+          </w:p>
+        </w:tc>
+      </w:tr>
+    </w:tbl>
+    <w:p/>
+    <w:p>
+      <w:pPr>
+        <w:spacing w:after="120"/>
+      </w:pPr>
+      <w:r>
+        <w:rPr>
+          <w:rFonts w:ascii="Times New Roman" w:hAnsi="Times New Roman" w:eastAsia="宋体"/>
+          <w:b w:val="0"/>
+          <w:sz w:val="18"/>
+        </w:rPr>
+        <w:t>注。（i）伪计数 0.10 为全文所用取值。（ii）严格集为五个损伤后时间点的并集；29 个候选在本分析之前即已确定，此处未重新筛选。（iii）18 次留一重采样中，保持校正显著的候选数在 22 至 29 之间。（iv）任何一次重采样中均没有候选的峰值落在 0.5 天或 1 天。（v）基于计数的再分析无法在这批数据上开展：本文所用的处理后矩阵不含原始计数，无法在其上拟合计数模型，此类分析须对已存档读段重新定量。（vi）29 个候选中有 5 个（Clec7a、Fcrl2、C4a、Dnase2、AABR07034445.1）未在单细胞参考的注释矩阵中找到，另有 8 个未通过可评估判据（最大检测率 &gt; 10 % 且最大平均表达 &gt; 0.1）：其中 7 个最大检测率低于 10 %（Fbxl7 (0.1 %); Reg3b (0.1 %); Svop (0.3 %); Ecel1 (0.5 %); Mmp3 (1.1 %); Chrna1 (2.1 %); Nlrc4 (2.5 %)），另 1 个（Gapt）最大检测率为 11.0 %、最大平均表达为 0.09，低于判据要求的 0.1。这两类均未列于面板 D。（vii）合并亚型使 16 个可评估候选中的 13 个、以及参考中检出的 24 个候选中的 15 个改变优势类型；全部分子的取值（含不可评估者）见 results/myeloid_merge_dominant_celltype.csv。</w:t>
       </w:r>
     </w:p>
     <w:sectPr>

</xml_diff>